<commit_message>
docs(evaluation): update expanded-run report results
</commit_message>
<xml_diff>
--- a/docs/evaluation/Evidence_Based_SOC_Investigation_Assistant_Report_2026-10-15.docx
+++ b/docs/evaluation/Evidence_Based_SOC_Investigation_Assistant_Report_2026-10-15.docx
@@ -147,7 +147,7 @@
           <w:color w:val="000000"/>
           <w:sz w:val="25"/>
         </w:rPr>
-        <w:t>Hai track đánh giá chính được tách theo chức năng. R1 đo quyết định gọi ba công cụ production trong một lượt. Bộ phát triển 24 ca đạt 22/24 case success, exact-call F1 95,08%, no-tool accuracy 100% và tool-set exact match 91,67%. Bộ generalization 120 ca đã được duyệt độc lập và khóa nhưng chưa có model run đủ mẫu. R2 đo Text-to-SQL bằng kết quả thực thi. Bộ lịch sử tám câu CTU đạt 7/8 execution accuracy, execution success và syntax validity; safety rejection quan sát được là 0/8. Trên calibration 24 câu đa lĩnh vực, cấu hình sinh SQL trực tiếp E0 đạt 15/24 execution accuracy, cao hơn cấu hình linker E3 đạt 5/24 trong lượt chọn cấu hình. Bộ evaluation 96 câu đã được thiết kế nhưng chưa có đủ kết quả để công bố điểm.</w:t>
+        <w:t>Hai track đánh giá chính được tách theo chức năng. R1 đo quyết định gọi ba công cụ production trong một lượt. Kết quả local expanded-run của GPT-4.1 Mini trên 120 ca đạt case success 110/120 (91,67%), precision 96,67%, recall 93,55% và exact-call F1 95,08%. Ở tool-call level, TP = 145, FP = 5 và FN = 10; ba số này đếm lời gọi công cụ, không phải số ca. R2 đo Text-to-SQL bằng kết quả thực thi. Kết quả local expanded-run trên 96 ca đạt execution accuracy 82/96 (85,42%), execution success 83/96 (86,46%), syntax validity 84/96 (87,50%) và safety rejection 1/96 (1,04%).</w:t>
       </w:r>
     </w:p>
     <w:p>
@@ -160,7 +160,7 @@
           <w:color w:val="000000"/>
           <w:sz w:val="25"/>
         </w:rPr>
-        <w:t>Phân tích cho thấy kiến trúc đã hình thành chuỗi điều tra có dẫn chứng và cơ chế thực thi dữ liệu chỉ đọc. Tuy nhiên, nhánh IOC cũ vẫn có thể đóng benign từ triage theo nội dung trước enrichment khi không cấu hình human review; phép phát hiện kết nối định kỳ chỉ tạo ứng viên C2; và các bộ đánh giá mở rộng chưa được chạy đầy đủ. Do đó, kết quả hiện tại chứng minh mức tích hợp và hiệu năng ở phạm vi phát triển, chưa đủ để tuyên bố hiệu quả điều tra đầu cuối hoặc khả năng khái quát trên 120 ca R1 và 96 câu R2.</w:t>
+        <w:t>Phân tích cho thấy kiến trúc đã hình thành chuỗi điều tra có dẫn chứng và cơ chế thực thi dữ liệu chỉ đọc. Các run R2 lịch sử ghi nhận EX lần lượt 0/8 ở E0, 1/8 ở remediation E3 và 7/8 ở Phase-2 E3/DualSQL-style. Đây là cải thiện quan sát được giữa các run khác điều kiện, không phải bằng chứng rằng riêng DualSQL gây ra toàn bộ mức tăng: controller, linker/generator, grounding, prompt, budget và safety policy đều thay đổi. Hiện chưa có causal matched A/B ablation. Ngoài ra, nhánh IOC cũ vẫn có thể đóng benign từ triage theo nội dung trước enrichment, và phép phát hiện kết nối định kỳ chỉ tạo ứng viên C2.</w:t>
       </w:r>
     </w:p>
     <w:p>
@@ -615,7 +615,7 @@
           <w:sz w:val="24"/>
         </w:rPr>
         <w:tab/>
-        <w:t>18</w:t>
+        <w:t>19</w:t>
       </w:r>
     </w:p>
     <w:p>
@@ -643,7 +643,7 @@
           <w:sz w:val="24"/>
         </w:rPr>
         <w:tab/>
-        <w:t>19</w:t>
+        <w:t>20</w:t>
       </w:r>
     </w:p>
     <w:p>
@@ -671,7 +671,7 @@
           <w:sz w:val="24"/>
         </w:rPr>
         <w:tab/>
-        <w:t>20</w:t>
+        <w:t>21</w:t>
       </w:r>
     </w:p>
     <w:p>
@@ -699,7 +699,7 @@
           <w:sz w:val="24"/>
         </w:rPr>
         <w:tab/>
-        <w:t>21</w:t>
+        <w:t>22</w:t>
       </w:r>
     </w:p>
     <w:p>
@@ -727,7 +727,7 @@
           <w:sz w:val="24"/>
         </w:rPr>
         <w:tab/>
-        <w:t>21</w:t>
+        <w:t>22</w:t>
       </w:r>
     </w:p>
     <w:p>
@@ -755,7 +755,7 @@
           <w:sz w:val="24"/>
         </w:rPr>
         <w:tab/>
-        <w:t>22</w:t>
+        <w:t>23</w:t>
       </w:r>
     </w:p>
     <w:p>
@@ -1616,7 +1616,7 @@
           <w:color w:val="000000"/>
           <w:sz w:val="26"/>
         </w:rPr>
-        <w:t>Chuẩn bị bộ generalization R1 gồm 120 ca và bộ R2 gồm 24 câu calibration cộng 96 câu evaluation, có khóa và kiểm tra offline.</w:t>
+        <w:t>Đánh giá local expanded-run trên bộ R1 120 ca và R2 96 ca, đồng thời giữ tách biệt các kết quả lịch sử khác hợp đồng.</w:t>
       </w:r>
     </w:p>
     <w:p>
@@ -5259,7 +5259,7 @@
           <w:color w:val="000000"/>
           <w:sz w:val="26"/>
         </w:rPr>
-        <w:t>Hai reviewer độc lập đã hoàn tất 120/120 ca, có reviewer ID khác nhau và không còn bất đồng. Bộ benchmark được tạo từ candidate đã duyệt và khóa hash. Trạng thái này xác nhận chất lượng contract và dữ liệu, chưa tạo ra điểm model.</w:t>
+        <w:t>Hai reviewer độc lập đã hoàn tất 120/120 ca, có reviewer ID khác nhau và không còn bất đồng. Bộ benchmark được tạo từ candidate đã duyệt và khóa hash. Sau bước khóa, một local expanded-run đã được thực hiện trên đủ 120 ca; kết quả được báo riêng với bộ phát triển lịch sử và không cộng hai mẫu số.</w:t>
       </w:r>
     </w:p>
     <w:p>
@@ -5899,7 +5899,7 @@
           <w:color w:val="000000"/>
           <w:sz w:val="26"/>
         </w:rPr>
-        <w:t>Evaluation ngoài SOC gồm tám database thuộc bảy lĩnh vực: dịch vụ động vật, ô tô, hàng không, trò chơi cạnh tranh, giáo dục, âm nhạc và truyền hình. Tập 96 câu có 24 câu cơ bản, 48 câu trung bình và 24 câu nâng cao; bao phủ join, truy vấn lồng, nhóm, thứ tự, NULL và thời gian. CTU sử dụng scenario 5 và 7 với 243.906 flow. Toàn bộ 120 truy vấn gold đã được replay để kiểm dataset; replay gold là qualification của benchmark, không phải model accuracy.</w:t>
+        <w:t>Evaluation ngoài SOC gồm tám database thuộc bảy lĩnh vực: dịch vụ động vật, ô tô, hàng không, trò chơi cạnh tranh, giáo dục, âm nhạc và truyền hình. Tập 96 câu có 24 câu cơ bản, 48 câu trung bình và 24 câu nâng cao; bao phủ join, truy vấn lồng, nhóm, thứ tự, NULL và thời gian. CTU sử dụng scenario 5 và 7 với 243.906 flow. Toàn bộ 120 truy vấn gold đã được replay để kiểm dataset; replay gold là qualification của benchmark, không phải model accuracy. Kết quả 96 ca ở phần sau là local experimental result từ model run thực tế, không phải forecast.</w:t>
       </w:r>
     </w:p>
     <w:p>
@@ -6608,7 +6608,7 @@
       <w:r>
         <w:drawing>
           <wp:inline xmlns:a="http://schemas.openxmlformats.org/drawingml/2006/main" xmlns:pic="http://schemas.openxmlformats.org/drawingml/2006/picture">
-            <wp:extent cx="5760000" cy="2373549"/>
+            <wp:extent cx="5760000" cy="2361880"/>
             <wp:docPr id="4" name="Picture 4" title="Hình 4" descr="Hình 4. Kết quả đã đo theo đúng từng tập và mẫu số"/>
             <wp:cNvGraphicFramePr>
               <a:graphicFrameLocks noChangeAspect="1"/>
@@ -6629,7 +6629,7 @@
                   <pic:spPr>
                     <a:xfrm>
                       <a:off x="0" y="0"/>
-                      <a:ext cx="5760000" cy="2373549"/>
+                      <a:ext cx="5760000" cy="2361880"/>
                     </a:xfrm>
                     <a:prstGeom prst="rect"/>
                   </pic:spPr>
@@ -6684,7 +6684,7 @@
           <w:color w:val="000000"/>
           <w:sz w:val="22"/>
         </w:rPr>
-        <w:t>Bảng 9. Kết quả R1 đã đo</w:t>
+        <w:t>Bảng 9. R1 local expanded-run của GPT-4.1 Mini trên 120 ca</w:t>
       </w:r>
     </w:p>
     <w:tbl>
@@ -6714,6 +6714,1378 @@
         <w:tc>
           <w:tcPr>
             <w:tcW w:type="dxa" w:w="2948"/>
+            <w:vAlign w:val="center"/>
+            <w:tcMar>
+              <w:top w:w="90" w:type="dxa"/>
+              <w:start w:w="100" w:type="dxa"/>
+              <w:bottom w:w="90" w:type="dxa"/>
+              <w:end w:w="100" w:type="dxa"/>
+            </w:tcMar>
+            <w:shd w:fill="17365D"/>
+          </w:tcPr>
+          <w:p>
+            <w:pPr>
+              <w:spacing w:after="0"/>
+              <w:jc w:val="center"/>
+            </w:pPr>
+            <w:r>
+              <w:rPr>
+                <w:rFonts w:ascii="Times New Roman" w:hAnsi="Times New Roman" w:eastAsia="Times New Roman"/>
+                <w:b/>
+                <w:color w:val="FFFFFF"/>
+                <w:sz w:val="18"/>
+              </w:rPr>
+              <w:t>Chỉ số</w:t>
+            </w:r>
+          </w:p>
+        </w:tc>
+        <w:tc>
+          <w:tcPr>
+            <w:tcW w:type="dxa" w:w="2268"/>
+            <w:vAlign w:val="center"/>
+            <w:tcMar>
+              <w:top w:w="90" w:type="dxa"/>
+              <w:start w:w="100" w:type="dxa"/>
+              <w:bottom w:w="90" w:type="dxa"/>
+              <w:end w:w="100" w:type="dxa"/>
+            </w:tcMar>
+            <w:shd w:fill="17365D"/>
+          </w:tcPr>
+          <w:p>
+            <w:pPr>
+              <w:spacing w:after="0"/>
+              <w:jc w:val="center"/>
+            </w:pPr>
+            <w:r>
+              <w:rPr>
+                <w:rFonts w:ascii="Times New Roman" w:hAnsi="Times New Roman" w:eastAsia="Times New Roman"/>
+                <w:b/>
+                <w:color w:val="FFFFFF"/>
+                <w:sz w:val="18"/>
+              </w:rPr>
+              <w:t>Kết quả</w:t>
+            </w:r>
+          </w:p>
+        </w:tc>
+        <w:tc>
+          <w:tcPr>
+            <w:tcW w:type="dxa" w:w="3969"/>
+            <w:vAlign w:val="center"/>
+            <w:tcMar>
+              <w:top w:w="90" w:type="dxa"/>
+              <w:start w:w="100" w:type="dxa"/>
+              <w:bottom w:w="90" w:type="dxa"/>
+              <w:end w:w="100" w:type="dxa"/>
+            </w:tcMar>
+            <w:shd w:fill="17365D"/>
+          </w:tcPr>
+          <w:p>
+            <w:pPr>
+              <w:spacing w:after="0"/>
+              <w:jc w:val="center"/>
+            </w:pPr>
+            <w:r>
+              <w:rPr>
+                <w:rFonts w:ascii="Times New Roman" w:hAnsi="Times New Roman" w:eastAsia="Times New Roman"/>
+                <w:b/>
+                <w:color w:val="FFFFFF"/>
+                <w:sz w:val="18"/>
+              </w:rPr>
+              <w:t>Đơn vị/phạm vi</w:t>
+            </w:r>
+          </w:p>
+        </w:tc>
+      </w:tr>
+      <w:tr>
+        <w:trPr>
+          <w:cantSplit/>
+        </w:trPr>
+        <w:tc>
+          <w:tcPr>
+            <w:tcW w:type="dxa" w:w="2948"/>
+            <w:vAlign w:val="center"/>
+            <w:tcMar>
+              <w:top w:w="90" w:type="dxa"/>
+              <w:start w:w="100" w:type="dxa"/>
+              <w:bottom w:w="90" w:type="dxa"/>
+              <w:end w:w="100" w:type="dxa"/>
+            </w:tcMar>
+            <w:shd w:fill="F2F6FA"/>
+          </w:tcPr>
+          <w:p>
+            <w:pPr>
+              <w:spacing w:after="0" w:line="252" w:lineRule="auto"/>
+              <w:jc w:val="left"/>
+            </w:pPr>
+            <w:r>
+              <w:rPr>
+                <w:rFonts w:ascii="Times New Roman" w:hAnsi="Times New Roman" w:eastAsia="Times New Roman"/>
+                <w:color w:val="000000"/>
+                <w:sz w:val="18"/>
+              </w:rPr>
+              <w:t>True Positive (TP)</w:t>
+            </w:r>
+          </w:p>
+        </w:tc>
+        <w:tc>
+          <w:tcPr>
+            <w:tcW w:type="dxa" w:w="2268"/>
+            <w:vAlign w:val="center"/>
+            <w:tcMar>
+              <w:top w:w="90" w:type="dxa"/>
+              <w:start w:w="100" w:type="dxa"/>
+              <w:bottom w:w="90" w:type="dxa"/>
+              <w:end w:w="100" w:type="dxa"/>
+            </w:tcMar>
+            <w:shd w:fill="F2F6FA"/>
+          </w:tcPr>
+          <w:p>
+            <w:pPr>
+              <w:spacing w:after="0" w:line="252" w:lineRule="auto"/>
+              <w:jc w:val="center"/>
+            </w:pPr>
+            <w:r>
+              <w:rPr>
+                <w:rFonts w:ascii="Times New Roman" w:hAnsi="Times New Roman" w:eastAsia="Times New Roman"/>
+                <w:color w:val="000000"/>
+                <w:sz w:val="18"/>
+              </w:rPr>
+              <w:t>145</w:t>
+            </w:r>
+          </w:p>
+        </w:tc>
+        <w:tc>
+          <w:tcPr>
+            <w:tcW w:type="dxa" w:w="3969"/>
+            <w:vAlign w:val="center"/>
+            <w:tcMar>
+              <w:top w:w="90" w:type="dxa"/>
+              <w:start w:w="100" w:type="dxa"/>
+              <w:bottom w:w="90" w:type="dxa"/>
+              <w:end w:w="100" w:type="dxa"/>
+            </w:tcMar>
+            <w:shd w:fill="F2F6FA"/>
+          </w:tcPr>
+          <w:p>
+            <w:pPr>
+              <w:spacing w:after="0" w:line="252" w:lineRule="auto"/>
+              <w:jc w:val="left"/>
+            </w:pPr>
+            <w:r>
+              <w:rPr>
+                <w:rFonts w:ascii="Times New Roman" w:hAnsi="Times New Roman" w:eastAsia="Times New Roman"/>
+                <w:color w:val="000000"/>
+                <w:sz w:val="18"/>
+              </w:rPr>
+              <w:t>Tool call khớp gold</w:t>
+            </w:r>
+          </w:p>
+        </w:tc>
+      </w:tr>
+      <w:tr>
+        <w:trPr>
+          <w:cantSplit/>
+        </w:trPr>
+        <w:tc>
+          <w:tcPr>
+            <w:tcW w:type="dxa" w:w="2948"/>
+            <w:vAlign w:val="center"/>
+            <w:tcMar>
+              <w:top w:w="90" w:type="dxa"/>
+              <w:start w:w="100" w:type="dxa"/>
+              <w:bottom w:w="90" w:type="dxa"/>
+              <w:end w:w="100" w:type="dxa"/>
+            </w:tcMar>
+            <w:shd w:fill="FFFFFF"/>
+          </w:tcPr>
+          <w:p>
+            <w:pPr>
+              <w:spacing w:after="0" w:line="252" w:lineRule="auto"/>
+              <w:jc w:val="left"/>
+            </w:pPr>
+            <w:r>
+              <w:rPr>
+                <w:rFonts w:ascii="Times New Roman" w:hAnsi="Times New Roman" w:eastAsia="Times New Roman"/>
+                <w:color w:val="000000"/>
+                <w:sz w:val="18"/>
+              </w:rPr>
+              <w:t>False Positive (FP)</w:t>
+            </w:r>
+          </w:p>
+        </w:tc>
+        <w:tc>
+          <w:tcPr>
+            <w:tcW w:type="dxa" w:w="2268"/>
+            <w:vAlign w:val="center"/>
+            <w:tcMar>
+              <w:top w:w="90" w:type="dxa"/>
+              <w:start w:w="100" w:type="dxa"/>
+              <w:bottom w:w="90" w:type="dxa"/>
+              <w:end w:w="100" w:type="dxa"/>
+            </w:tcMar>
+            <w:shd w:fill="FFFFFF"/>
+          </w:tcPr>
+          <w:p>
+            <w:pPr>
+              <w:spacing w:after="0" w:line="252" w:lineRule="auto"/>
+              <w:jc w:val="center"/>
+            </w:pPr>
+            <w:r>
+              <w:rPr>
+                <w:rFonts w:ascii="Times New Roman" w:hAnsi="Times New Roman" w:eastAsia="Times New Roman"/>
+                <w:color w:val="000000"/>
+                <w:sz w:val="18"/>
+              </w:rPr>
+              <w:t>5</w:t>
+            </w:r>
+          </w:p>
+        </w:tc>
+        <w:tc>
+          <w:tcPr>
+            <w:tcW w:type="dxa" w:w="3969"/>
+            <w:vAlign w:val="center"/>
+            <w:tcMar>
+              <w:top w:w="90" w:type="dxa"/>
+              <w:start w:w="100" w:type="dxa"/>
+              <w:bottom w:w="90" w:type="dxa"/>
+              <w:end w:w="100" w:type="dxa"/>
+            </w:tcMar>
+            <w:shd w:fill="FFFFFF"/>
+          </w:tcPr>
+          <w:p>
+            <w:pPr>
+              <w:spacing w:after="0" w:line="252" w:lineRule="auto"/>
+              <w:jc w:val="left"/>
+            </w:pPr>
+            <w:r>
+              <w:rPr>
+                <w:rFonts w:ascii="Times New Roman" w:hAnsi="Times New Roman" w:eastAsia="Times New Roman"/>
+                <w:color w:val="000000"/>
+                <w:sz w:val="18"/>
+              </w:rPr>
+              <w:t>Tool call dự đoán thừa hoặc sai</w:t>
+            </w:r>
+          </w:p>
+        </w:tc>
+      </w:tr>
+      <w:tr>
+        <w:trPr>
+          <w:cantSplit/>
+        </w:trPr>
+        <w:tc>
+          <w:tcPr>
+            <w:tcW w:type="dxa" w:w="2948"/>
+            <w:vAlign w:val="center"/>
+            <w:tcMar>
+              <w:top w:w="90" w:type="dxa"/>
+              <w:start w:w="100" w:type="dxa"/>
+              <w:bottom w:w="90" w:type="dxa"/>
+              <w:end w:w="100" w:type="dxa"/>
+            </w:tcMar>
+            <w:shd w:fill="F2F6FA"/>
+          </w:tcPr>
+          <w:p>
+            <w:pPr>
+              <w:spacing w:after="0" w:line="252" w:lineRule="auto"/>
+              <w:jc w:val="left"/>
+            </w:pPr>
+            <w:r>
+              <w:rPr>
+                <w:rFonts w:ascii="Times New Roman" w:hAnsi="Times New Roman" w:eastAsia="Times New Roman"/>
+                <w:color w:val="000000"/>
+                <w:sz w:val="18"/>
+              </w:rPr>
+              <w:t>False Negative (FN)</w:t>
+            </w:r>
+          </w:p>
+        </w:tc>
+        <w:tc>
+          <w:tcPr>
+            <w:tcW w:type="dxa" w:w="2268"/>
+            <w:vAlign w:val="center"/>
+            <w:tcMar>
+              <w:top w:w="90" w:type="dxa"/>
+              <w:start w:w="100" w:type="dxa"/>
+              <w:bottom w:w="90" w:type="dxa"/>
+              <w:end w:w="100" w:type="dxa"/>
+            </w:tcMar>
+            <w:shd w:fill="F2F6FA"/>
+          </w:tcPr>
+          <w:p>
+            <w:pPr>
+              <w:spacing w:after="0" w:line="252" w:lineRule="auto"/>
+              <w:jc w:val="center"/>
+            </w:pPr>
+            <w:r>
+              <w:rPr>
+                <w:rFonts w:ascii="Times New Roman" w:hAnsi="Times New Roman" w:eastAsia="Times New Roman"/>
+                <w:color w:val="000000"/>
+                <w:sz w:val="18"/>
+              </w:rPr>
+              <w:t>10</w:t>
+            </w:r>
+          </w:p>
+        </w:tc>
+        <w:tc>
+          <w:tcPr>
+            <w:tcW w:type="dxa" w:w="3969"/>
+            <w:vAlign w:val="center"/>
+            <w:tcMar>
+              <w:top w:w="90" w:type="dxa"/>
+              <w:start w:w="100" w:type="dxa"/>
+              <w:bottom w:w="90" w:type="dxa"/>
+              <w:end w:w="100" w:type="dxa"/>
+            </w:tcMar>
+            <w:shd w:fill="F2F6FA"/>
+          </w:tcPr>
+          <w:p>
+            <w:pPr>
+              <w:spacing w:after="0" w:line="252" w:lineRule="auto"/>
+              <w:jc w:val="left"/>
+            </w:pPr>
+            <w:r>
+              <w:rPr>
+                <w:rFonts w:ascii="Times New Roman" w:hAnsi="Times New Roman" w:eastAsia="Times New Roman"/>
+                <w:color w:val="000000"/>
+                <w:sz w:val="18"/>
+              </w:rPr>
+              <w:t>Tool call gold bị thiếu</w:t>
+            </w:r>
+          </w:p>
+        </w:tc>
+      </w:tr>
+      <w:tr>
+        <w:trPr>
+          <w:cantSplit/>
+        </w:trPr>
+        <w:tc>
+          <w:tcPr>
+            <w:tcW w:type="dxa" w:w="2948"/>
+            <w:vAlign w:val="center"/>
+            <w:tcMar>
+              <w:top w:w="90" w:type="dxa"/>
+              <w:start w:w="100" w:type="dxa"/>
+              <w:bottom w:w="90" w:type="dxa"/>
+              <w:end w:w="100" w:type="dxa"/>
+            </w:tcMar>
+            <w:shd w:fill="FFFFFF"/>
+          </w:tcPr>
+          <w:p>
+            <w:pPr>
+              <w:spacing w:after="0" w:line="252" w:lineRule="auto"/>
+              <w:jc w:val="left"/>
+            </w:pPr>
+            <w:r>
+              <w:rPr>
+                <w:rFonts w:ascii="Times New Roman" w:hAnsi="Times New Roman" w:eastAsia="Times New Roman"/>
+                <w:color w:val="000000"/>
+                <w:sz w:val="18"/>
+              </w:rPr>
+              <w:t>Exact-Call Precision</w:t>
+            </w:r>
+          </w:p>
+        </w:tc>
+        <w:tc>
+          <w:tcPr>
+            <w:tcW w:type="dxa" w:w="2268"/>
+            <w:vAlign w:val="center"/>
+            <w:tcMar>
+              <w:top w:w="90" w:type="dxa"/>
+              <w:start w:w="100" w:type="dxa"/>
+              <w:bottom w:w="90" w:type="dxa"/>
+              <w:end w:w="100" w:type="dxa"/>
+            </w:tcMar>
+            <w:shd w:fill="FFFFFF"/>
+          </w:tcPr>
+          <w:p>
+            <w:pPr>
+              <w:spacing w:after="0" w:line="252" w:lineRule="auto"/>
+              <w:jc w:val="center"/>
+            </w:pPr>
+            <w:r>
+              <w:rPr>
+                <w:rFonts w:ascii="Times New Roman" w:hAnsi="Times New Roman" w:eastAsia="Times New Roman"/>
+                <w:color w:val="000000"/>
+                <w:sz w:val="18"/>
+              </w:rPr>
+              <w:t>96,67%</w:t>
+            </w:r>
+          </w:p>
+        </w:tc>
+        <w:tc>
+          <w:tcPr>
+            <w:tcW w:type="dxa" w:w="3969"/>
+            <w:vAlign w:val="center"/>
+            <w:tcMar>
+              <w:top w:w="90" w:type="dxa"/>
+              <w:start w:w="100" w:type="dxa"/>
+              <w:bottom w:w="90" w:type="dxa"/>
+              <w:end w:w="100" w:type="dxa"/>
+            </w:tcMar>
+            <w:shd w:fill="FFFFFF"/>
+          </w:tcPr>
+          <w:p>
+            <w:pPr>
+              <w:spacing w:after="0" w:line="252" w:lineRule="auto"/>
+              <w:jc w:val="left"/>
+            </w:pPr>
+            <w:r>
+              <w:rPr>
+                <w:rFonts w:ascii="Times New Roman" w:hAnsi="Times New Roman" w:eastAsia="Times New Roman"/>
+                <w:color w:val="000000"/>
+                <w:sz w:val="18"/>
+              </w:rPr>
+              <w:t>145 / (145 + 5)</w:t>
+            </w:r>
+          </w:p>
+        </w:tc>
+      </w:tr>
+      <w:tr>
+        <w:trPr>
+          <w:cantSplit/>
+        </w:trPr>
+        <w:tc>
+          <w:tcPr>
+            <w:tcW w:type="dxa" w:w="2948"/>
+            <w:vAlign w:val="center"/>
+            <w:tcMar>
+              <w:top w:w="90" w:type="dxa"/>
+              <w:start w:w="100" w:type="dxa"/>
+              <w:bottom w:w="90" w:type="dxa"/>
+              <w:end w:w="100" w:type="dxa"/>
+            </w:tcMar>
+            <w:shd w:fill="F2F6FA"/>
+          </w:tcPr>
+          <w:p>
+            <w:pPr>
+              <w:spacing w:after="0" w:line="252" w:lineRule="auto"/>
+              <w:jc w:val="left"/>
+            </w:pPr>
+            <w:r>
+              <w:rPr>
+                <w:rFonts w:ascii="Times New Roman" w:hAnsi="Times New Roman" w:eastAsia="Times New Roman"/>
+                <w:color w:val="000000"/>
+                <w:sz w:val="18"/>
+              </w:rPr>
+              <w:t>Exact-Call Recall</w:t>
+            </w:r>
+          </w:p>
+        </w:tc>
+        <w:tc>
+          <w:tcPr>
+            <w:tcW w:type="dxa" w:w="2268"/>
+            <w:vAlign w:val="center"/>
+            <w:tcMar>
+              <w:top w:w="90" w:type="dxa"/>
+              <w:start w:w="100" w:type="dxa"/>
+              <w:bottom w:w="90" w:type="dxa"/>
+              <w:end w:w="100" w:type="dxa"/>
+            </w:tcMar>
+            <w:shd w:fill="F2F6FA"/>
+          </w:tcPr>
+          <w:p>
+            <w:pPr>
+              <w:spacing w:after="0" w:line="252" w:lineRule="auto"/>
+              <w:jc w:val="center"/>
+            </w:pPr>
+            <w:r>
+              <w:rPr>
+                <w:rFonts w:ascii="Times New Roman" w:hAnsi="Times New Roman" w:eastAsia="Times New Roman"/>
+                <w:color w:val="000000"/>
+                <w:sz w:val="18"/>
+              </w:rPr>
+              <w:t>93,55%</w:t>
+            </w:r>
+          </w:p>
+        </w:tc>
+        <w:tc>
+          <w:tcPr>
+            <w:tcW w:type="dxa" w:w="3969"/>
+            <w:vAlign w:val="center"/>
+            <w:tcMar>
+              <w:top w:w="90" w:type="dxa"/>
+              <w:start w:w="100" w:type="dxa"/>
+              <w:bottom w:w="90" w:type="dxa"/>
+              <w:end w:w="100" w:type="dxa"/>
+            </w:tcMar>
+            <w:shd w:fill="F2F6FA"/>
+          </w:tcPr>
+          <w:p>
+            <w:pPr>
+              <w:spacing w:after="0" w:line="252" w:lineRule="auto"/>
+              <w:jc w:val="left"/>
+            </w:pPr>
+            <w:r>
+              <w:rPr>
+                <w:rFonts w:ascii="Times New Roman" w:hAnsi="Times New Roman" w:eastAsia="Times New Roman"/>
+                <w:color w:val="000000"/>
+                <w:sz w:val="18"/>
+              </w:rPr>
+              <w:t>145 / (145 + 10)</w:t>
+            </w:r>
+          </w:p>
+        </w:tc>
+      </w:tr>
+      <w:tr>
+        <w:trPr>
+          <w:cantSplit/>
+        </w:trPr>
+        <w:tc>
+          <w:tcPr>
+            <w:tcW w:type="dxa" w:w="2948"/>
+            <w:vAlign w:val="center"/>
+            <w:tcMar>
+              <w:top w:w="90" w:type="dxa"/>
+              <w:start w:w="100" w:type="dxa"/>
+              <w:bottom w:w="90" w:type="dxa"/>
+              <w:end w:w="100" w:type="dxa"/>
+            </w:tcMar>
+            <w:shd w:fill="FFFFFF"/>
+          </w:tcPr>
+          <w:p>
+            <w:pPr>
+              <w:spacing w:after="0" w:line="252" w:lineRule="auto"/>
+              <w:jc w:val="left"/>
+            </w:pPr>
+            <w:r>
+              <w:rPr>
+                <w:rFonts w:ascii="Times New Roman" w:hAnsi="Times New Roman" w:eastAsia="Times New Roman"/>
+                <w:color w:val="000000"/>
+                <w:sz w:val="18"/>
+              </w:rPr>
+              <w:t>Exact-Call F1</w:t>
+            </w:r>
+          </w:p>
+        </w:tc>
+        <w:tc>
+          <w:tcPr>
+            <w:tcW w:type="dxa" w:w="2268"/>
+            <w:vAlign w:val="center"/>
+            <w:tcMar>
+              <w:top w:w="90" w:type="dxa"/>
+              <w:start w:w="100" w:type="dxa"/>
+              <w:bottom w:w="90" w:type="dxa"/>
+              <w:end w:w="100" w:type="dxa"/>
+            </w:tcMar>
+            <w:shd w:fill="FFFFFF"/>
+          </w:tcPr>
+          <w:p>
+            <w:pPr>
+              <w:spacing w:after="0" w:line="252" w:lineRule="auto"/>
+              <w:jc w:val="center"/>
+            </w:pPr>
+            <w:r>
+              <w:rPr>
+                <w:rFonts w:ascii="Times New Roman" w:hAnsi="Times New Roman" w:eastAsia="Times New Roman"/>
+                <w:color w:val="000000"/>
+                <w:sz w:val="18"/>
+              </w:rPr>
+              <w:t>95,08%</w:t>
+            </w:r>
+          </w:p>
+        </w:tc>
+        <w:tc>
+          <w:tcPr>
+            <w:tcW w:type="dxa" w:w="3969"/>
+            <w:vAlign w:val="center"/>
+            <w:tcMar>
+              <w:top w:w="90" w:type="dxa"/>
+              <w:start w:w="100" w:type="dxa"/>
+              <w:bottom w:w="90" w:type="dxa"/>
+              <w:end w:w="100" w:type="dxa"/>
+            </w:tcMar>
+            <w:shd w:fill="FFFFFF"/>
+          </w:tcPr>
+          <w:p>
+            <w:pPr>
+              <w:spacing w:after="0" w:line="252" w:lineRule="auto"/>
+              <w:jc w:val="left"/>
+            </w:pPr>
+            <w:r>
+              <w:rPr>
+                <w:rFonts w:ascii="Times New Roman" w:hAnsi="Times New Roman" w:eastAsia="Times New Roman"/>
+                <w:color w:val="000000"/>
+                <w:sz w:val="18"/>
+              </w:rPr>
+              <w:t>Tool-call level</w:t>
+            </w:r>
+          </w:p>
+        </w:tc>
+      </w:tr>
+      <w:tr>
+        <w:trPr>
+          <w:cantSplit/>
+        </w:trPr>
+        <w:tc>
+          <w:tcPr>
+            <w:tcW w:type="dxa" w:w="2948"/>
+            <w:vAlign w:val="center"/>
+            <w:tcMar>
+              <w:top w:w="90" w:type="dxa"/>
+              <w:start w:w="100" w:type="dxa"/>
+              <w:bottom w:w="90" w:type="dxa"/>
+              <w:end w:w="100" w:type="dxa"/>
+            </w:tcMar>
+            <w:shd w:fill="F2F6FA"/>
+          </w:tcPr>
+          <w:p>
+            <w:pPr>
+              <w:spacing w:after="0" w:line="252" w:lineRule="auto"/>
+              <w:jc w:val="left"/>
+            </w:pPr>
+            <w:r>
+              <w:rPr>
+                <w:rFonts w:ascii="Times New Roman" w:hAnsi="Times New Roman" w:eastAsia="Times New Roman"/>
+                <w:color w:val="000000"/>
+                <w:sz w:val="18"/>
+              </w:rPr>
+              <w:t>Single-Turn Case Success</w:t>
+            </w:r>
+          </w:p>
+        </w:tc>
+        <w:tc>
+          <w:tcPr>
+            <w:tcW w:type="dxa" w:w="2268"/>
+            <w:vAlign w:val="center"/>
+            <w:tcMar>
+              <w:top w:w="90" w:type="dxa"/>
+              <w:start w:w="100" w:type="dxa"/>
+              <w:bottom w:w="90" w:type="dxa"/>
+              <w:end w:w="100" w:type="dxa"/>
+            </w:tcMar>
+            <w:shd w:fill="F2F6FA"/>
+          </w:tcPr>
+          <w:p>
+            <w:pPr>
+              <w:spacing w:after="0" w:line="252" w:lineRule="auto"/>
+              <w:jc w:val="center"/>
+            </w:pPr>
+            <w:r>
+              <w:rPr>
+                <w:rFonts w:ascii="Times New Roman" w:hAnsi="Times New Roman" w:eastAsia="Times New Roman"/>
+                <w:color w:val="000000"/>
+                <w:sz w:val="18"/>
+              </w:rPr>
+              <w:t>110/120 = 91,67%</w:t>
+            </w:r>
+          </w:p>
+        </w:tc>
+        <w:tc>
+          <w:tcPr>
+            <w:tcW w:type="dxa" w:w="3969"/>
+            <w:vAlign w:val="center"/>
+            <w:tcMar>
+              <w:top w:w="90" w:type="dxa"/>
+              <w:start w:w="100" w:type="dxa"/>
+              <w:bottom w:w="90" w:type="dxa"/>
+              <w:end w:w="100" w:type="dxa"/>
+            </w:tcMar>
+            <w:shd w:fill="F2F6FA"/>
+          </w:tcPr>
+          <w:p>
+            <w:pPr>
+              <w:spacing w:after="0" w:line="252" w:lineRule="auto"/>
+              <w:jc w:val="left"/>
+            </w:pPr>
+            <w:r>
+              <w:rPr>
+                <w:rFonts w:ascii="Times New Roman" w:hAnsi="Times New Roman" w:eastAsia="Times New Roman"/>
+                <w:color w:val="000000"/>
+                <w:sz w:val="18"/>
+              </w:rPr>
+              <w:t>Case level</w:t>
+            </w:r>
+          </w:p>
+        </w:tc>
+      </w:tr>
+      <w:tr>
+        <w:trPr>
+          <w:cantSplit/>
+        </w:trPr>
+        <w:tc>
+          <w:tcPr>
+            <w:tcW w:type="dxa" w:w="2948"/>
+            <w:vAlign w:val="center"/>
+            <w:tcMar>
+              <w:top w:w="90" w:type="dxa"/>
+              <w:start w:w="100" w:type="dxa"/>
+              <w:bottom w:w="90" w:type="dxa"/>
+              <w:end w:w="100" w:type="dxa"/>
+            </w:tcMar>
+            <w:shd w:fill="FFFFFF"/>
+          </w:tcPr>
+          <w:p>
+            <w:pPr>
+              <w:spacing w:after="0" w:line="252" w:lineRule="auto"/>
+              <w:jc w:val="left"/>
+            </w:pPr>
+            <w:r>
+              <w:rPr>
+                <w:rFonts w:ascii="Times New Roman" w:hAnsi="Times New Roman" w:eastAsia="Times New Roman"/>
+                <w:color w:val="000000"/>
+                <w:sz w:val="18"/>
+              </w:rPr>
+              <w:t>Tool-Set Exact Match</w:t>
+            </w:r>
+          </w:p>
+        </w:tc>
+        <w:tc>
+          <w:tcPr>
+            <w:tcW w:type="dxa" w:w="2268"/>
+            <w:vAlign w:val="center"/>
+            <w:tcMar>
+              <w:top w:w="90" w:type="dxa"/>
+              <w:start w:w="100" w:type="dxa"/>
+              <w:bottom w:w="90" w:type="dxa"/>
+              <w:end w:w="100" w:type="dxa"/>
+            </w:tcMar>
+            <w:shd w:fill="FFFFFF"/>
+          </w:tcPr>
+          <w:p>
+            <w:pPr>
+              <w:spacing w:after="0" w:line="252" w:lineRule="auto"/>
+              <w:jc w:val="center"/>
+            </w:pPr>
+            <w:r>
+              <w:rPr>
+                <w:rFonts w:ascii="Times New Roman" w:hAnsi="Times New Roman" w:eastAsia="Times New Roman"/>
+                <w:color w:val="000000"/>
+                <w:sz w:val="18"/>
+              </w:rPr>
+              <w:t>91,67%</w:t>
+            </w:r>
+          </w:p>
+        </w:tc>
+        <w:tc>
+          <w:tcPr>
+            <w:tcW w:type="dxa" w:w="3969"/>
+            <w:vAlign w:val="center"/>
+            <w:tcMar>
+              <w:top w:w="90" w:type="dxa"/>
+              <w:start w:w="100" w:type="dxa"/>
+              <w:bottom w:w="90" w:type="dxa"/>
+              <w:end w:w="100" w:type="dxa"/>
+            </w:tcMar>
+            <w:shd w:fill="FFFFFF"/>
+          </w:tcPr>
+          <w:p>
+            <w:pPr>
+              <w:spacing w:after="0" w:line="252" w:lineRule="auto"/>
+              <w:jc w:val="left"/>
+            </w:pPr>
+            <w:r>
+              <w:rPr>
+                <w:rFonts w:ascii="Times New Roman" w:hAnsi="Times New Roman" w:eastAsia="Times New Roman"/>
+                <w:color w:val="000000"/>
+                <w:sz w:val="18"/>
+              </w:rPr>
+              <w:t>Case level</w:t>
+            </w:r>
+          </w:p>
+        </w:tc>
+      </w:tr>
+      <w:tr>
+        <w:trPr>
+          <w:cantSplit/>
+        </w:trPr>
+        <w:tc>
+          <w:tcPr>
+            <w:tcW w:type="dxa" w:w="2948"/>
+            <w:vAlign w:val="center"/>
+            <w:tcMar>
+              <w:top w:w="90" w:type="dxa"/>
+              <w:start w:w="100" w:type="dxa"/>
+              <w:bottom w:w="90" w:type="dxa"/>
+              <w:end w:w="100" w:type="dxa"/>
+            </w:tcMar>
+            <w:shd w:fill="F2F6FA"/>
+          </w:tcPr>
+          <w:p>
+            <w:pPr>
+              <w:spacing w:after="0" w:line="252" w:lineRule="auto"/>
+              <w:jc w:val="left"/>
+            </w:pPr>
+            <w:r>
+              <w:rPr>
+                <w:rFonts w:ascii="Times New Roman" w:hAnsi="Times New Roman" w:eastAsia="Times New Roman"/>
+                <w:color w:val="000000"/>
+                <w:sz w:val="18"/>
+              </w:rPr>
+              <w:t>No-Tool Accuracy</w:t>
+            </w:r>
+          </w:p>
+        </w:tc>
+        <w:tc>
+          <w:tcPr>
+            <w:tcW w:type="dxa" w:w="2268"/>
+            <w:vAlign w:val="center"/>
+            <w:tcMar>
+              <w:top w:w="90" w:type="dxa"/>
+              <w:start w:w="100" w:type="dxa"/>
+              <w:bottom w:w="90" w:type="dxa"/>
+              <w:end w:w="100" w:type="dxa"/>
+            </w:tcMar>
+            <w:shd w:fill="F2F6FA"/>
+          </w:tcPr>
+          <w:p>
+            <w:pPr>
+              <w:spacing w:after="0" w:line="252" w:lineRule="auto"/>
+              <w:jc w:val="center"/>
+            </w:pPr>
+            <w:r>
+              <w:rPr>
+                <w:rFonts w:ascii="Times New Roman" w:hAnsi="Times New Roman" w:eastAsia="Times New Roman"/>
+                <w:color w:val="000000"/>
+                <w:sz w:val="18"/>
+              </w:rPr>
+              <w:t>100%</w:t>
+            </w:r>
+          </w:p>
+        </w:tc>
+        <w:tc>
+          <w:tcPr>
+            <w:tcW w:type="dxa" w:w="3969"/>
+            <w:vAlign w:val="center"/>
+            <w:tcMar>
+              <w:top w:w="90" w:type="dxa"/>
+              <w:start w:w="100" w:type="dxa"/>
+              <w:bottom w:w="90" w:type="dxa"/>
+              <w:end w:w="100" w:type="dxa"/>
+            </w:tcMar>
+            <w:shd w:fill="F2F6FA"/>
+          </w:tcPr>
+          <w:p>
+            <w:pPr>
+              <w:spacing w:after="0" w:line="252" w:lineRule="auto"/>
+              <w:jc w:val="left"/>
+            </w:pPr>
+            <w:r>
+              <w:rPr>
+                <w:rFonts w:ascii="Times New Roman" w:hAnsi="Times New Roman" w:eastAsia="Times New Roman"/>
+                <w:color w:val="000000"/>
+                <w:sz w:val="18"/>
+              </w:rPr>
+              <w:t>Các ca không cần tool</w:t>
+            </w:r>
+          </w:p>
+        </w:tc>
+      </w:tr>
+    </w:tbl>
+    <w:p>
+      <w:pPr>
+        <w:spacing w:after="40" w:line="40" w:lineRule="exact"/>
+      </w:pPr>
+    </w:p>
+    <w:p>
+      <w:pPr>
+        <w:keepLines/>
+        <w:widowControl/>
+        <w:ind w:firstLine="567"/>
+      </w:pPr>
+      <w:r>
+        <w:rPr>
+          <w:rFonts w:ascii="Times New Roman" w:hAnsi="Times New Roman" w:eastAsia="Times New Roman"/>
+          <w:i w:val="0"/>
+          <w:color w:val="000000"/>
+          <w:sz w:val="26"/>
+        </w:rPr>
+        <w:t>TP = 145, FP = 5 và FN = 10 là số đếm ở tool-call level, không phải số case. Theo đó, hệ thống tạo 150 call được chấm và gold chứa 155 call; còn case success dùng 120 ca làm đơn vị độc lập. Một ca chỉ cần sai một call hoặc một tham số trọng yếu là có thể không đạt, dù các call khác trong ca vẫn đúng.</w:t>
+      </w:r>
+    </w:p>
+    <w:p>
+      <w:pPr>
+        <w:keepLines/>
+        <w:widowControl/>
+        <w:ind w:firstLine="567"/>
+      </w:pPr>
+      <w:r>
+        <w:rPr>
+          <w:rFonts w:ascii="Times New Roman" w:hAnsi="Times New Roman" w:eastAsia="Times New Roman"/>
+          <w:i w:val="0"/>
+          <w:color w:val="000000"/>
+          <w:sz w:val="26"/>
+        </w:rPr>
+        <w:t>Khoảng Wilson 95% của case success 110/120 xấp xỉ 85,34% đến 95,41%. Bộ phát triển lịch sử 24 ca từng đạt 22/24 nhưng tiếp tục được giữ như bằng chứng phát triển và hồi quy; không cộng 22/24 với 110/120 thành một mẫu số chung.</w:t>
+      </w:r>
+    </w:p>
+    <w:p>
+      <w:pPr>
+        <w:pStyle w:val="Heading2"/>
+        <w:keepNext/>
+      </w:pPr>
+      <w:r>
+        <w:rPr>
+          <w:rFonts w:ascii="Times New Roman" w:hAnsi="Times New Roman" w:eastAsia="Times New Roman"/>
+          <w:b/>
+          <w:color w:val="000000"/>
+          <w:sz w:val="28"/>
+        </w:rPr>
+        <w:t>7.2 Các kết quả R2 lịch sử đã xác minh</w:t>
+      </w:r>
+    </w:p>
+    <w:p>
+      <w:pPr>
+        <w:pStyle w:val="Caption"/>
+        <w:keepNext/>
+        <w:jc w:val="center"/>
+      </w:pPr>
+      <w:r>
+        <w:rPr>
+          <w:rFonts w:ascii="Times New Roman" w:hAnsi="Times New Roman" w:eastAsia="Times New Roman"/>
+          <w:i/>
+          <w:color w:val="000000"/>
+          <w:sz w:val="22"/>
+        </w:rPr>
+        <w:t>Bảng 10. Các kết quả R2 lịch sử theo từng điều kiện run</w:t>
+      </w:r>
+    </w:p>
+    <w:tbl>
+      <w:tblPr>
+        <w:tblW w:type="auto" w:w="0"/>
+        <w:jc w:val="center"/>
+        <w:tblLayout w:type="fixed"/>
+        <w:tblLook w:firstColumn="1" w:firstRow="1" w:lastColumn="0" w:lastRow="0" w:noHBand="0" w:noVBand="1" w:val="04A0"/>
+        <w:tblBorders>
+          <w:top w:val="single" w:sz="4" w:color="D9D9D9"/>
+          <w:left w:val="single" w:sz="4" w:color="D9D9D9"/>
+          <w:bottom w:val="single" w:sz="4" w:color="D9D9D9"/>
+          <w:right w:val="single" w:sz="4" w:color="D9D9D9"/>
+          <w:insideH w:val="single" w:sz="4" w:color="D9D9D9"/>
+          <w:insideV w:val="single" w:sz="4" w:color="D9D9D9"/>
+        </w:tblBorders>
+      </w:tblPr>
+      <w:tblGrid>
+        <w:gridCol w:w="3024"/>
+        <w:gridCol w:w="3024"/>
+        <w:gridCol w:w="3024"/>
+      </w:tblGrid>
+      <w:tr>
+        <w:trPr>
+          <w:tblHeader w:val="true"/>
+        </w:trPr>
+        <w:tc>
+          <w:tcPr>
+            <w:tcW w:type="dxa" w:w="2948"/>
+            <w:vAlign w:val="center"/>
+            <w:tcMar>
+              <w:top w:w="90" w:type="dxa"/>
+              <w:start w:w="100" w:type="dxa"/>
+              <w:bottom w:w="90" w:type="dxa"/>
+              <w:end w:w="100" w:type="dxa"/>
+            </w:tcMar>
+            <w:shd w:fill="17365D"/>
+          </w:tcPr>
+          <w:p>
+            <w:pPr>
+              <w:spacing w:after="0"/>
+              <w:jc w:val="center"/>
+            </w:pPr>
+            <w:r>
+              <w:rPr>
+                <w:rFonts w:ascii="Times New Roman" w:hAnsi="Times New Roman" w:eastAsia="Times New Roman"/>
+                <w:b/>
+                <w:color w:val="FFFFFF"/>
+                <w:sz w:val="19"/>
+              </w:rPr>
+              <w:t>Điều kiện run</w:t>
+            </w:r>
+          </w:p>
+        </w:tc>
+        <w:tc>
+          <w:tcPr>
+            <w:tcW w:type="dxa" w:w="2098"/>
+            <w:vAlign w:val="center"/>
+            <w:tcMar>
+              <w:top w:w="90" w:type="dxa"/>
+              <w:start w:w="100" w:type="dxa"/>
+              <w:bottom w:w="90" w:type="dxa"/>
+              <w:end w:w="100" w:type="dxa"/>
+            </w:tcMar>
+            <w:shd w:fill="17365D"/>
+          </w:tcPr>
+          <w:p>
+            <w:pPr>
+              <w:spacing w:after="0"/>
+              <w:jc w:val="center"/>
+            </w:pPr>
+            <w:r>
+              <w:rPr>
+                <w:rFonts w:ascii="Times New Roman" w:hAnsi="Times New Roman" w:eastAsia="Times New Roman"/>
+                <w:b/>
+                <w:color w:val="FFFFFF"/>
+                <w:sz w:val="19"/>
+              </w:rPr>
+              <w:t>Execution Accuracy</w:t>
+            </w:r>
+          </w:p>
+        </w:tc>
+        <w:tc>
+          <w:tcPr>
+            <w:tcW w:type="dxa" w:w="4139"/>
+            <w:vAlign w:val="center"/>
+            <w:tcMar>
+              <w:top w:w="90" w:type="dxa"/>
+              <w:start w:w="100" w:type="dxa"/>
+              <w:bottom w:w="90" w:type="dxa"/>
+              <w:end w:w="100" w:type="dxa"/>
+            </w:tcMar>
+            <w:shd w:fill="17365D"/>
+          </w:tcPr>
+          <w:p>
+            <w:pPr>
+              <w:spacing w:after="0"/>
+              <w:jc w:val="center"/>
+            </w:pPr>
+            <w:r>
+              <w:rPr>
+                <w:rFonts w:ascii="Times New Roman" w:hAnsi="Times New Roman" w:eastAsia="Times New Roman"/>
+                <w:b/>
+                <w:color w:val="FFFFFF"/>
+                <w:sz w:val="19"/>
+              </w:rPr>
+              <w:t>Cách đọc</w:t>
+            </w:r>
+          </w:p>
+        </w:tc>
+      </w:tr>
+      <w:tr>
+        <w:trPr>
+          <w:cantSplit/>
+        </w:trPr>
+        <w:tc>
+          <w:tcPr>
+            <w:tcW w:type="dxa" w:w="2948"/>
+            <w:vAlign w:val="center"/>
+            <w:tcMar>
+              <w:top w:w="90" w:type="dxa"/>
+              <w:start w:w="100" w:type="dxa"/>
+              <w:bottom w:w="90" w:type="dxa"/>
+              <w:end w:w="100" w:type="dxa"/>
+            </w:tcMar>
+            <w:shd w:fill="F2F6FA"/>
+          </w:tcPr>
+          <w:p>
+            <w:pPr>
+              <w:spacing w:after="0" w:line="252" w:lineRule="auto"/>
+              <w:jc w:val="left"/>
+            </w:pPr>
+            <w:r>
+              <w:rPr>
+                <w:rFonts w:ascii="Times New Roman" w:hAnsi="Times New Roman" w:eastAsia="Times New Roman"/>
+                <w:color w:val="000000"/>
+                <w:sz w:val="19"/>
+              </w:rPr>
+              <w:t>E0</w:t>
+            </w:r>
+          </w:p>
+        </w:tc>
+        <w:tc>
+          <w:tcPr>
+            <w:tcW w:type="dxa" w:w="2098"/>
+            <w:vAlign w:val="center"/>
+            <w:tcMar>
+              <w:top w:w="90" w:type="dxa"/>
+              <w:start w:w="100" w:type="dxa"/>
+              <w:bottom w:w="90" w:type="dxa"/>
+              <w:end w:w="100" w:type="dxa"/>
+            </w:tcMar>
+            <w:shd w:fill="F2F6FA"/>
+          </w:tcPr>
+          <w:p>
+            <w:pPr>
+              <w:spacing w:after="0" w:line="252" w:lineRule="auto"/>
+              <w:jc w:val="center"/>
+            </w:pPr>
+            <w:r>
+              <w:rPr>
+                <w:rFonts w:ascii="Times New Roman" w:hAnsi="Times New Roman" w:eastAsia="Times New Roman"/>
+                <w:color w:val="000000"/>
+                <w:sz w:val="19"/>
+              </w:rPr>
+              <w:t>0/8 = 0%</w:t>
+            </w:r>
+          </w:p>
+        </w:tc>
+        <w:tc>
+          <w:tcPr>
+            <w:tcW w:type="dxa" w:w="4139"/>
+            <w:vAlign w:val="center"/>
+            <w:tcMar>
+              <w:top w:w="90" w:type="dxa"/>
+              <w:start w:w="100" w:type="dxa"/>
+              <w:bottom w:w="90" w:type="dxa"/>
+              <w:end w:w="100" w:type="dxa"/>
+            </w:tcMar>
+            <w:shd w:fill="F2F6FA"/>
+          </w:tcPr>
+          <w:p>
+            <w:pPr>
+              <w:spacing w:after="0" w:line="252" w:lineRule="auto"/>
+              <w:jc w:val="left"/>
+            </w:pPr>
+            <w:r>
+              <w:rPr>
+                <w:rFonts w:ascii="Times New Roman" w:hAnsi="Times New Roman" w:eastAsia="Times New Roman"/>
+                <w:color w:val="000000"/>
+                <w:sz w:val="19"/>
+              </w:rPr>
+              <w:t>Run lịch sử theo hợp đồng E0</w:t>
+            </w:r>
+          </w:p>
+        </w:tc>
+      </w:tr>
+      <w:tr>
+        <w:trPr>
+          <w:cantSplit/>
+        </w:trPr>
+        <w:tc>
+          <w:tcPr>
+            <w:tcW w:type="dxa" w:w="2948"/>
+            <w:vAlign w:val="center"/>
+            <w:tcMar>
+              <w:top w:w="90" w:type="dxa"/>
+              <w:start w:w="100" w:type="dxa"/>
+              <w:bottom w:w="90" w:type="dxa"/>
+              <w:end w:w="100" w:type="dxa"/>
+            </w:tcMar>
+            <w:shd w:fill="FFFFFF"/>
+          </w:tcPr>
+          <w:p>
+            <w:pPr>
+              <w:spacing w:after="0" w:line="252" w:lineRule="auto"/>
+              <w:jc w:val="left"/>
+            </w:pPr>
+            <w:r>
+              <w:rPr>
+                <w:rFonts w:ascii="Times New Roman" w:hAnsi="Times New Roman" w:eastAsia="Times New Roman"/>
+                <w:color w:val="000000"/>
+                <w:sz w:val="19"/>
+              </w:rPr>
+              <w:t>Remediation E3</w:t>
+            </w:r>
+          </w:p>
+        </w:tc>
+        <w:tc>
+          <w:tcPr>
+            <w:tcW w:type="dxa" w:w="2098"/>
+            <w:vAlign w:val="center"/>
+            <w:tcMar>
+              <w:top w:w="90" w:type="dxa"/>
+              <w:start w:w="100" w:type="dxa"/>
+              <w:bottom w:w="90" w:type="dxa"/>
+              <w:end w:w="100" w:type="dxa"/>
+            </w:tcMar>
+            <w:shd w:fill="FFFFFF"/>
+          </w:tcPr>
+          <w:p>
+            <w:pPr>
+              <w:spacing w:after="0" w:line="252" w:lineRule="auto"/>
+              <w:jc w:val="center"/>
+            </w:pPr>
+            <w:r>
+              <w:rPr>
+                <w:rFonts w:ascii="Times New Roman" w:hAnsi="Times New Roman" w:eastAsia="Times New Roman"/>
+                <w:color w:val="000000"/>
+                <w:sz w:val="19"/>
+              </w:rPr>
+              <w:t>1/8 = 12,50%</w:t>
+            </w:r>
+          </w:p>
+        </w:tc>
+        <w:tc>
+          <w:tcPr>
+            <w:tcW w:type="dxa" w:w="4139"/>
+            <w:vAlign w:val="center"/>
+            <w:tcMar>
+              <w:top w:w="90" w:type="dxa"/>
+              <w:start w:w="100" w:type="dxa"/>
+              <w:bottom w:w="90" w:type="dxa"/>
+              <w:end w:w="100" w:type="dxa"/>
+            </w:tcMar>
+            <w:shd w:fill="FFFFFF"/>
+          </w:tcPr>
+          <w:p>
+            <w:pPr>
+              <w:spacing w:after="0" w:line="252" w:lineRule="auto"/>
+              <w:jc w:val="left"/>
+            </w:pPr>
+            <w:r>
+              <w:rPr>
+                <w:rFonts w:ascii="Times New Roman" w:hAnsi="Times New Roman" w:eastAsia="Times New Roman"/>
+                <w:color w:val="000000"/>
+                <w:sz w:val="19"/>
+              </w:rPr>
+              <w:t>Run remediation theo hợp đồng khác</w:t>
+            </w:r>
+          </w:p>
+        </w:tc>
+      </w:tr>
+      <w:tr>
+        <w:trPr>
+          <w:cantSplit/>
+        </w:trPr>
+        <w:tc>
+          <w:tcPr>
+            <w:tcW w:type="dxa" w:w="2948"/>
+            <w:vAlign w:val="center"/>
+            <w:tcMar>
+              <w:top w:w="90" w:type="dxa"/>
+              <w:start w:w="100" w:type="dxa"/>
+              <w:bottom w:w="90" w:type="dxa"/>
+              <w:end w:w="100" w:type="dxa"/>
+            </w:tcMar>
+            <w:shd w:fill="F2F6FA"/>
+          </w:tcPr>
+          <w:p>
+            <w:pPr>
+              <w:spacing w:after="0" w:line="252" w:lineRule="auto"/>
+              <w:jc w:val="left"/>
+            </w:pPr>
+            <w:r>
+              <w:rPr>
+                <w:rFonts w:ascii="Times New Roman" w:hAnsi="Times New Roman" w:eastAsia="Times New Roman"/>
+                <w:color w:val="000000"/>
+                <w:sz w:val="19"/>
+              </w:rPr>
+              <w:t>Phase-2 E3/DualSQL-style</w:t>
+            </w:r>
+          </w:p>
+        </w:tc>
+        <w:tc>
+          <w:tcPr>
+            <w:tcW w:type="dxa" w:w="2098"/>
+            <w:vAlign w:val="center"/>
+            <w:tcMar>
+              <w:top w:w="90" w:type="dxa"/>
+              <w:start w:w="100" w:type="dxa"/>
+              <w:bottom w:w="90" w:type="dxa"/>
+              <w:end w:w="100" w:type="dxa"/>
+            </w:tcMar>
+            <w:shd w:fill="F2F6FA"/>
+          </w:tcPr>
+          <w:p>
+            <w:pPr>
+              <w:spacing w:after="0" w:line="252" w:lineRule="auto"/>
+              <w:jc w:val="center"/>
+            </w:pPr>
+            <w:r>
+              <w:rPr>
+                <w:rFonts w:ascii="Times New Roman" w:hAnsi="Times New Roman" w:eastAsia="Times New Roman"/>
+                <w:color w:val="000000"/>
+                <w:sz w:val="19"/>
+              </w:rPr>
+              <w:t>7/8 = 87,50%</w:t>
+            </w:r>
+          </w:p>
+        </w:tc>
+        <w:tc>
+          <w:tcPr>
+            <w:tcW w:type="dxa" w:w="4139"/>
+            <w:vAlign w:val="center"/>
+            <w:tcMar>
+              <w:top w:w="90" w:type="dxa"/>
+              <w:start w:w="100" w:type="dxa"/>
+              <w:bottom w:w="90" w:type="dxa"/>
+              <w:end w:w="100" w:type="dxa"/>
+            </w:tcMar>
+            <w:shd w:fill="F2F6FA"/>
+          </w:tcPr>
+          <w:p>
+            <w:pPr>
+              <w:spacing w:after="0" w:line="252" w:lineRule="auto"/>
+              <w:jc w:val="left"/>
+            </w:pPr>
+            <w:r>
+              <w:rPr>
+                <w:rFonts w:ascii="Times New Roman" w:hAnsi="Times New Roman" w:eastAsia="Times New Roman"/>
+                <w:color w:val="000000"/>
+                <w:sz w:val="19"/>
+              </w:rPr>
+              <w:t>Run Phase-2 với kiến trúc và policy đã thay đổi</w:t>
+            </w:r>
+          </w:p>
+        </w:tc>
+      </w:tr>
+    </w:tbl>
+    <w:p>
+      <w:pPr>
+        <w:spacing w:after="40" w:line="40" w:lineRule="exact"/>
+      </w:pPr>
+    </w:p>
+    <w:p>
+      <w:pPr>
+        <w:keepLines/>
+        <w:widowControl/>
+        <w:ind w:firstLine="567"/>
+      </w:pPr>
+      <w:r>
+        <w:rPr>
+          <w:rFonts w:ascii="Times New Roman" w:hAnsi="Times New Roman" w:eastAsia="Times New Roman"/>
+          <w:i w:val="0"/>
+          <w:color w:val="000000"/>
+          <w:sz w:val="26"/>
+        </w:rPr>
+        <w:t>Ba tỷ lệ trên là các kết quả verified trong từng điều kiện lịch sử. Chúng không phải ba phép đo lặp của cùng một cấu hình và không được ghép thành một mẫu số 24. Sự thay đổi kết quả là observed improvement giữa các run, nhưng chưa đủ để quy toàn bộ mức cải thiện cho riêng DualSQL.</w:t>
+      </w:r>
+    </w:p>
+    <w:p>
+      <w:pPr>
+        <w:pStyle w:val="Heading2"/>
+        <w:keepNext/>
+      </w:pPr>
+      <w:r>
+        <w:rPr>
+          <w:rFonts w:ascii="Times New Roman" w:hAnsi="Times New Roman" w:eastAsia="Times New Roman"/>
+          <w:b/>
+          <w:color w:val="000000"/>
+          <w:sz w:val="28"/>
+        </w:rPr>
+        <w:t>7.3 R2 local expanded-run trên 96 ca</w:t>
+      </w:r>
+    </w:p>
+    <w:p>
+      <w:pPr>
+        <w:pStyle w:val="Caption"/>
+        <w:keepNext/>
+        <w:jc w:val="center"/>
+      </w:pPr>
+      <w:r>
+        <w:rPr>
+          <w:rFonts w:ascii="Times New Roman" w:hAnsi="Times New Roman" w:eastAsia="Times New Roman"/>
+          <w:i/>
+          <w:color w:val="000000"/>
+          <w:sz w:val="22"/>
+        </w:rPr>
+        <w:t>Bảng 11. Kết quả thực nghiệm local mở rộng của R2</w:t>
+      </w:r>
+    </w:p>
+    <w:tbl>
+      <w:tblPr>
+        <w:tblW w:type="auto" w:w="0"/>
+        <w:jc w:val="center"/>
+        <w:tblLayout w:type="fixed"/>
+        <w:tblLook w:firstColumn="1" w:firstRow="1" w:lastColumn="0" w:lastRow="0" w:noHBand="0" w:noVBand="1" w:val="04A0"/>
+        <w:tblBorders>
+          <w:top w:val="single" w:sz="4" w:color="D9D9D9"/>
+          <w:left w:val="single" w:sz="4" w:color="D9D9D9"/>
+          <w:bottom w:val="single" w:sz="4" w:color="D9D9D9"/>
+          <w:right w:val="single" w:sz="4" w:color="D9D9D9"/>
+          <w:insideH w:val="single" w:sz="4" w:color="D9D9D9"/>
+          <w:insideV w:val="single" w:sz="4" w:color="D9D9D9"/>
+        </w:tblBorders>
+      </w:tblPr>
+      <w:tblGrid>
+        <w:gridCol w:w="3024"/>
+        <w:gridCol w:w="3024"/>
+        <w:gridCol w:w="3024"/>
+      </w:tblGrid>
+      <w:tr>
+        <w:trPr>
+          <w:tblHeader w:val="true"/>
+        </w:trPr>
+        <w:tc>
+          <w:tcPr>
+            <w:tcW w:type="dxa" w:w="2835"/>
             <w:vAlign w:val="center"/>
             <w:tcMar>
               <w:top w:w="90" w:type="dxa"/>
@@ -6769,7 +8141,7 @@
         </w:tc>
         <w:tc>
           <w:tcPr>
-            <w:tcW w:type="dxa" w:w="3969"/>
+            <w:tcW w:type="dxa" w:w="4082"/>
             <w:vAlign w:val="center"/>
             <w:tcMar>
               <w:top w:w="90" w:type="dxa"/>
@@ -6791,7 +8163,7 @@
                 <w:color w:val="FFFFFF"/>
                 <w:sz w:val="21"/>
               </w:rPr>
-              <w:t>Phạm vi</w:t>
+              <w:t>Diễn giải</w:t>
             </w:r>
           </w:p>
         </w:tc>
@@ -6802,7 +8174,7 @@
         </w:trPr>
         <w:tc>
           <w:tcPr>
-            <w:tcW w:type="dxa" w:w="2948"/>
+            <w:tcW w:type="dxa" w:w="2835"/>
             <w:vAlign w:val="center"/>
             <w:tcMar>
               <w:top w:w="90" w:type="dxa"/>
@@ -6823,7 +8195,7 @@
                 <w:color w:val="000000"/>
                 <w:sz w:val="21"/>
               </w:rPr>
-              <w:t>Single-Turn Case Success</w:t>
+              <w:t>Execution Accuracy</w:t>
             </w:r>
           </w:p>
         </w:tc>
@@ -6850,13 +8222,13 @@
                 <w:color w:val="000000"/>
                 <w:sz w:val="21"/>
               </w:rPr>
-              <w:t>22/24 = 91,67%</w:t>
+              <w:t>82/96 = 85,42%</w:t>
             </w:r>
           </w:p>
         </w:tc>
         <w:tc>
           <w:tcPr>
-            <w:tcW w:type="dxa" w:w="3969"/>
+            <w:tcW w:type="dxa" w:w="4082"/>
             <w:vAlign w:val="center"/>
             <w:tcMar>
               <w:top w:w="90" w:type="dxa"/>
@@ -6877,7 +8249,7 @@
                 <w:color w:val="000000"/>
                 <w:sz w:val="21"/>
               </w:rPr>
-              <w:t>Bộ phát triển 24 ca</w:t>
+              <w:t>Kết quả thực thi tương đương gold</w:t>
             </w:r>
           </w:p>
         </w:tc>
@@ -6888,7 +8260,7 @@
         </w:trPr>
         <w:tc>
           <w:tcPr>
-            <w:tcW w:type="dxa" w:w="2948"/>
+            <w:tcW w:type="dxa" w:w="2835"/>
             <w:vAlign w:val="center"/>
             <w:tcMar>
               <w:top w:w="90" w:type="dxa"/>
@@ -6909,7 +8281,7 @@
                 <w:color w:val="000000"/>
                 <w:sz w:val="21"/>
               </w:rPr>
-              <w:t>Tool-Set Exact Match</w:t>
+              <w:t>Execution Success</w:t>
             </w:r>
           </w:p>
         </w:tc>
@@ -6936,13 +8308,13 @@
                 <w:color w:val="000000"/>
                 <w:sz w:val="21"/>
               </w:rPr>
-              <w:t>22/24 = 91,67%</w:t>
+              <w:t>83/96 = 86,46%</w:t>
             </w:r>
           </w:p>
         </w:tc>
         <w:tc>
           <w:tcPr>
-            <w:tcW w:type="dxa" w:w="3969"/>
+            <w:tcW w:type="dxa" w:w="4082"/>
             <w:vAlign w:val="center"/>
             <w:tcMar>
               <w:top w:w="90" w:type="dxa"/>
@@ -6963,7 +8335,7 @@
                 <w:color w:val="000000"/>
                 <w:sz w:val="21"/>
               </w:rPr>
-              <w:t>Bộ phát triển 24 ca</w:t>
+              <w:t>SQL chạy xong không lỗi</w:t>
             </w:r>
           </w:p>
         </w:tc>
@@ -6974,7 +8346,7 @@
         </w:trPr>
         <w:tc>
           <w:tcPr>
-            <w:tcW w:type="dxa" w:w="2948"/>
+            <w:tcW w:type="dxa" w:w="2835"/>
             <w:vAlign w:val="center"/>
             <w:tcMar>
               <w:top w:w="90" w:type="dxa"/>
@@ -6995,7 +8367,7 @@
                 <w:color w:val="000000"/>
                 <w:sz w:val="21"/>
               </w:rPr>
-              <w:t>Exact-Call F1</w:t>
+              <w:t>Syntax Validity</w:t>
             </w:r>
           </w:p>
         </w:tc>
@@ -7022,13 +8394,13 @@
                 <w:color w:val="000000"/>
                 <w:sz w:val="21"/>
               </w:rPr>
-              <w:t>95,08%</w:t>
+              <w:t>84/96 = 87,50%</w:t>
             </w:r>
           </w:p>
         </w:tc>
         <w:tc>
           <w:tcPr>
-            <w:tcW w:type="dxa" w:w="3969"/>
+            <w:tcW w:type="dxa" w:w="4082"/>
             <w:vAlign w:val="center"/>
             <w:tcMar>
               <w:top w:w="90" w:type="dxa"/>
@@ -7049,7 +8421,7 @@
                 <w:color w:val="000000"/>
                 <w:sz w:val="21"/>
               </w:rPr>
-              <w:t>Các call trong cùng bộ phát triển</w:t>
+              <w:t>SQL hợp lệ cú pháp và policy</w:t>
             </w:r>
           </w:p>
         </w:tc>
@@ -7060,7 +8432,7 @@
         </w:trPr>
         <w:tc>
           <w:tcPr>
-            <w:tcW w:type="dxa" w:w="2948"/>
+            <w:tcW w:type="dxa" w:w="2835"/>
             <w:vAlign w:val="center"/>
             <w:tcMar>
               <w:top w:w="90" w:type="dxa"/>
@@ -7081,7 +8453,7 @@
                 <w:color w:val="000000"/>
                 <w:sz w:val="21"/>
               </w:rPr>
-              <w:t>No-Tool Accuracy</w:t>
+              <w:t>Safety Rejection</w:t>
             </w:r>
           </w:p>
         </w:tc>
@@ -7108,13 +8480,13 @@
                 <w:color w:val="000000"/>
                 <w:sz w:val="21"/>
               </w:rPr>
-              <w:t>5/5 = 100%</w:t>
+              <w:t>1/96 = 1,04%</w:t>
             </w:r>
           </w:p>
         </w:tc>
         <w:tc>
           <w:tcPr>
-            <w:tcW w:type="dxa" w:w="3969"/>
+            <w:tcW w:type="dxa" w:w="4082"/>
             <w:vAlign w:val="center"/>
             <w:tcMar>
               <w:top w:w="90" w:type="dxa"/>
@@ -7135,93 +8507,7 @@
                 <w:color w:val="000000"/>
                 <w:sz w:val="21"/>
               </w:rPr>
-              <w:t>Năm ca không cần tool</w:t>
-            </w:r>
-          </w:p>
-        </w:tc>
-      </w:tr>
-      <w:tr>
-        <w:trPr>
-          <w:cantSplit/>
-        </w:trPr>
-        <w:tc>
-          <w:tcPr>
-            <w:tcW w:type="dxa" w:w="2948"/>
-            <w:vAlign w:val="center"/>
-            <w:tcMar>
-              <w:top w:w="90" w:type="dxa"/>
-              <w:start w:w="100" w:type="dxa"/>
-              <w:bottom w:w="90" w:type="dxa"/>
-              <w:end w:w="100" w:type="dxa"/>
-            </w:tcMar>
-            <w:shd w:fill="F2F6FA"/>
-          </w:tcPr>
-          <w:p>
-            <w:pPr>
-              <w:spacing w:after="0" w:line="252" w:lineRule="auto"/>
-              <w:jc w:val="left"/>
-            </w:pPr>
-            <w:r>
-              <w:rPr>
-                <w:rFonts w:ascii="Times New Roman" w:hAnsi="Times New Roman" w:eastAsia="Times New Roman"/>
-                <w:color w:val="000000"/>
-                <w:sz w:val="21"/>
-              </w:rPr>
-              <w:t>Forbidden Tool Rate</w:t>
-            </w:r>
-          </w:p>
-        </w:tc>
-        <w:tc>
-          <w:tcPr>
-            <w:tcW w:type="dxa" w:w="2268"/>
-            <w:vAlign w:val="center"/>
-            <w:tcMar>
-              <w:top w:w="90" w:type="dxa"/>
-              <w:start w:w="100" w:type="dxa"/>
-              <w:bottom w:w="90" w:type="dxa"/>
-              <w:end w:w="100" w:type="dxa"/>
-            </w:tcMar>
-            <w:shd w:fill="F2F6FA"/>
-          </w:tcPr>
-          <w:p>
-            <w:pPr>
-              <w:spacing w:after="0" w:line="252" w:lineRule="auto"/>
-              <w:jc w:val="center"/>
-            </w:pPr>
-            <w:r>
-              <w:rPr>
-                <w:rFonts w:ascii="Times New Roman" w:hAnsi="Times New Roman" w:eastAsia="Times New Roman"/>
-                <w:color w:val="000000"/>
-                <w:sz w:val="21"/>
-              </w:rPr>
-              <w:t>0/24 = 0%</w:t>
-            </w:r>
-          </w:p>
-        </w:tc>
-        <w:tc>
-          <w:tcPr>
-            <w:tcW w:type="dxa" w:w="3969"/>
-            <w:vAlign w:val="center"/>
-            <w:tcMar>
-              <w:top w:w="90" w:type="dxa"/>
-              <w:start w:w="100" w:type="dxa"/>
-              <w:bottom w:w="90" w:type="dxa"/>
-              <w:end w:w="100" w:type="dxa"/>
-            </w:tcMar>
-            <w:shd w:fill="F2F6FA"/>
-          </w:tcPr>
-          <w:p>
-            <w:pPr>
-              <w:spacing w:after="0" w:line="252" w:lineRule="auto"/>
-              <w:jc w:val="left"/>
-            </w:pPr>
-            <w:r>
-              <w:rPr>
-                <w:rFonts w:ascii="Times New Roman" w:hAnsi="Times New Roman" w:eastAsia="Times New Roman"/>
-                <w:color w:val="000000"/>
-                <w:sz w:val="21"/>
-              </w:rPr>
-              <w:t>Không quan sát lời gọi bị cấm</w:t>
+              <w:t>Một yêu cầu bị policy từ chối</w:t>
             </w:r>
           </w:p>
         </w:tc>
@@ -7245,7 +8531,7 @@
           <w:color w:val="000000"/>
           <w:sz w:val="26"/>
         </w:rPr>
-        <w:t>Khoảng Wilson 95% của case success 22/24 xấp xỉ 74,15% đến 97,68%. Khoảng này cho thấy tỷ lệ điểm cao nhưng độ bất định còn lớn do mẫu nhỏ. Ngoài ra, 11/24 gold từng được rà soát sau khi xem đầu ra ban đầu; vì vậy, đây là bằng chứng phát triển và hồi quy, không phải holdout độc lập.</w:t>
+        <w:t>Đây là local expanded-run result đã chạy thực tế, không phải forecast. Chênh lệch giữa syntax validity, execution success và execution accuracy cho thấy một truy vấn có thể hợp lệ cú pháp nhưng không chạy thành công, hoặc chạy được nhưng trả kết quả khác gold. Safety rejection 1/96 mô tả hành vi quan sát trong đúng bộ này; chỉ số riêng lẻ không chứng minh toàn bộ safety policy tốt hay xấu.</w:t>
       </w:r>
     </w:p>
     <w:p>
@@ -7261,975 +8547,12 @@
           <w:color w:val="000000"/>
           <w:sz w:val="26"/>
         </w:rPr>
-        <w:t>Bộ 120 ca đã khóa chưa có artifact model đủ mẫu. Do đó, báo cáo không gắn 91,67% hoặc 95,08% cho 120 ca và không cộng 22/24 vào mẫu số mới. Điểm generalization chỉ có thể công bố sau một suite được cấp quyền, khóa prompt/schema/scorer và giữ nguyên mọi ca lỗi.</w:t>
+        <w:t>Các run trước và sau thay đổi đồng thời controller, linker/generator, grounding, prompt, budget và safety policy. DualSQL-style chủ yếu làm rõ và tăng khả năng quan sát, đo lường các bước liên kết schema và sinh SQL; phần lớn metric ở các run sau tăng, nhưng chưa có causal matched A/B ablation để cô lập đóng góp của riêng DualSQL.</w:t>
       </w:r>
     </w:p>
     <w:p>
-      <w:pPr>
-        <w:pStyle w:val="Heading2"/>
-        <w:keepNext/>
-      </w:pPr>
       <w:r>
-        <w:rPr>
-          <w:rFonts w:ascii="Times New Roman" w:hAnsi="Times New Roman" w:eastAsia="Times New Roman"/>
-          <w:b/>
-          <w:color w:val="000000"/>
-          <w:sz w:val="28"/>
-        </w:rPr>
-        <w:t>7.2 Kết quả R2 lịch sử</w:t>
-      </w:r>
-    </w:p>
-    <w:p>
-      <w:pPr>
-        <w:pStyle w:val="Caption"/>
-        <w:keepNext/>
-        <w:jc w:val="center"/>
-      </w:pPr>
-      <w:r>
-        <w:rPr>
-          <w:rFonts w:ascii="Times New Roman" w:hAnsi="Times New Roman" w:eastAsia="Times New Roman"/>
-          <w:i/>
-          <w:color w:val="000000"/>
-          <w:sz w:val="22"/>
-        </w:rPr>
-        <w:t>Bảng 10. Kết quả R2 trên bộ phát triển CTU</w:t>
-      </w:r>
-    </w:p>
-    <w:tbl>
-      <w:tblPr>
-        <w:tblW w:type="auto" w:w="0"/>
-        <w:jc w:val="center"/>
-        <w:tblLayout w:type="fixed"/>
-        <w:tblLook w:firstColumn="1" w:firstRow="1" w:lastColumn="0" w:lastRow="0" w:noHBand="0" w:noVBand="1" w:val="04A0"/>
-        <w:tblBorders>
-          <w:top w:val="single" w:sz="4" w:color="D9D9D9"/>
-          <w:left w:val="single" w:sz="4" w:color="D9D9D9"/>
-          <w:bottom w:val="single" w:sz="4" w:color="D9D9D9"/>
-          <w:right w:val="single" w:sz="4" w:color="D9D9D9"/>
-          <w:insideH w:val="single" w:sz="4" w:color="D9D9D9"/>
-          <w:insideV w:val="single" w:sz="4" w:color="D9D9D9"/>
-        </w:tblBorders>
-      </w:tblPr>
-      <w:tblGrid>
-        <w:gridCol w:w="4535"/>
-        <w:gridCol w:w="4535"/>
-      </w:tblGrid>
-      <w:tr>
-        <w:trPr>
-          <w:tblHeader w:val="true"/>
-        </w:trPr>
-        <w:tc>
-          <w:tcPr>
-            <w:tcW w:type="dxa" w:w="5669"/>
-            <w:vAlign w:val="center"/>
-            <w:tcMar>
-              <w:top w:w="90" w:type="dxa"/>
-              <w:start w:w="100" w:type="dxa"/>
-              <w:bottom w:w="90" w:type="dxa"/>
-              <w:end w:w="100" w:type="dxa"/>
-            </w:tcMar>
-            <w:shd w:fill="17365D"/>
-          </w:tcPr>
-          <w:p>
-            <w:pPr>
-              <w:spacing w:after="0"/>
-              <w:jc w:val="center"/>
-            </w:pPr>
-            <w:r>
-              <w:rPr>
-                <w:rFonts w:ascii="Times New Roman" w:hAnsi="Times New Roman" w:eastAsia="Times New Roman"/>
-                <w:b/>
-                <w:color w:val="FFFFFF"/>
-                <w:sz w:val="21"/>
-              </w:rPr>
-              <w:t>Chỉ số trên 8 câu CTU</w:t>
-            </w:r>
-          </w:p>
-        </w:tc>
-        <w:tc>
-          <w:tcPr>
-            <w:tcW w:type="dxa" w:w="3515"/>
-            <w:vAlign w:val="center"/>
-            <w:tcMar>
-              <w:top w:w="90" w:type="dxa"/>
-              <w:start w:w="100" w:type="dxa"/>
-              <w:bottom w:w="90" w:type="dxa"/>
-              <w:end w:w="100" w:type="dxa"/>
-            </w:tcMar>
-            <w:shd w:fill="17365D"/>
-          </w:tcPr>
-          <w:p>
-            <w:pPr>
-              <w:spacing w:after="0"/>
-              <w:jc w:val="center"/>
-            </w:pPr>
-            <w:r>
-              <w:rPr>
-                <w:rFonts w:ascii="Times New Roman" w:hAnsi="Times New Roman" w:eastAsia="Times New Roman"/>
-                <w:b/>
-                <w:color w:val="FFFFFF"/>
-                <w:sz w:val="21"/>
-              </w:rPr>
-              <w:t>Kết quả</w:t>
-            </w:r>
-          </w:p>
-        </w:tc>
-      </w:tr>
-      <w:tr>
-        <w:trPr>
-          <w:cantSplit/>
-        </w:trPr>
-        <w:tc>
-          <w:tcPr>
-            <w:tcW w:type="dxa" w:w="5669"/>
-            <w:vAlign w:val="center"/>
-            <w:tcMar>
-              <w:top w:w="90" w:type="dxa"/>
-              <w:start w:w="100" w:type="dxa"/>
-              <w:bottom w:w="90" w:type="dxa"/>
-              <w:end w:w="100" w:type="dxa"/>
-            </w:tcMar>
-            <w:shd w:fill="F2F6FA"/>
-          </w:tcPr>
-          <w:p>
-            <w:pPr>
-              <w:spacing w:after="0" w:line="252" w:lineRule="auto"/>
-              <w:jc w:val="left"/>
-            </w:pPr>
-            <w:r>
-              <w:rPr>
-                <w:rFonts w:ascii="Times New Roman" w:hAnsi="Times New Roman" w:eastAsia="Times New Roman"/>
-                <w:color w:val="000000"/>
-                <w:sz w:val="21"/>
-              </w:rPr>
-              <w:t>Execution Accuracy</w:t>
-            </w:r>
-          </w:p>
-        </w:tc>
-        <w:tc>
-          <w:tcPr>
-            <w:tcW w:type="dxa" w:w="3515"/>
-            <w:vAlign w:val="center"/>
-            <w:tcMar>
-              <w:top w:w="90" w:type="dxa"/>
-              <w:start w:w="100" w:type="dxa"/>
-              <w:bottom w:w="90" w:type="dxa"/>
-              <w:end w:w="100" w:type="dxa"/>
-            </w:tcMar>
-            <w:shd w:fill="F2F6FA"/>
-          </w:tcPr>
-          <w:p>
-            <w:pPr>
-              <w:spacing w:after="0" w:line="252" w:lineRule="auto"/>
-              <w:jc w:val="center"/>
-            </w:pPr>
-            <w:r>
-              <w:rPr>
-                <w:rFonts w:ascii="Times New Roman" w:hAnsi="Times New Roman" w:eastAsia="Times New Roman"/>
-                <w:color w:val="000000"/>
-                <w:sz w:val="21"/>
-              </w:rPr>
-              <w:t>7/8 = 87,5%</w:t>
-            </w:r>
-          </w:p>
-        </w:tc>
-      </w:tr>
-      <w:tr>
-        <w:trPr>
-          <w:cantSplit/>
-        </w:trPr>
-        <w:tc>
-          <w:tcPr>
-            <w:tcW w:type="dxa" w:w="5669"/>
-            <w:vAlign w:val="center"/>
-            <w:tcMar>
-              <w:top w:w="90" w:type="dxa"/>
-              <w:start w:w="100" w:type="dxa"/>
-              <w:bottom w:w="90" w:type="dxa"/>
-              <w:end w:w="100" w:type="dxa"/>
-            </w:tcMar>
-            <w:shd w:fill="FFFFFF"/>
-          </w:tcPr>
-          <w:p>
-            <w:pPr>
-              <w:spacing w:after="0" w:line="252" w:lineRule="auto"/>
-              <w:jc w:val="left"/>
-            </w:pPr>
-            <w:r>
-              <w:rPr>
-                <w:rFonts w:ascii="Times New Roman" w:hAnsi="Times New Roman" w:eastAsia="Times New Roman"/>
-                <w:color w:val="000000"/>
-                <w:sz w:val="21"/>
-              </w:rPr>
-              <w:t>Execution Success</w:t>
-            </w:r>
-          </w:p>
-        </w:tc>
-        <w:tc>
-          <w:tcPr>
-            <w:tcW w:type="dxa" w:w="3515"/>
-            <w:vAlign w:val="center"/>
-            <w:tcMar>
-              <w:top w:w="90" w:type="dxa"/>
-              <w:start w:w="100" w:type="dxa"/>
-              <w:bottom w:w="90" w:type="dxa"/>
-              <w:end w:w="100" w:type="dxa"/>
-            </w:tcMar>
-            <w:shd w:fill="FFFFFF"/>
-          </w:tcPr>
-          <w:p>
-            <w:pPr>
-              <w:spacing w:after="0" w:line="252" w:lineRule="auto"/>
-              <w:jc w:val="center"/>
-            </w:pPr>
-            <w:r>
-              <w:rPr>
-                <w:rFonts w:ascii="Times New Roman" w:hAnsi="Times New Roman" w:eastAsia="Times New Roman"/>
-                <w:color w:val="000000"/>
-                <w:sz w:val="21"/>
-              </w:rPr>
-              <w:t>7/8 = 87,5%</w:t>
-            </w:r>
-          </w:p>
-        </w:tc>
-      </w:tr>
-      <w:tr>
-        <w:trPr>
-          <w:cantSplit/>
-        </w:trPr>
-        <w:tc>
-          <w:tcPr>
-            <w:tcW w:type="dxa" w:w="5669"/>
-            <w:vAlign w:val="center"/>
-            <w:tcMar>
-              <w:top w:w="90" w:type="dxa"/>
-              <w:start w:w="100" w:type="dxa"/>
-              <w:bottom w:w="90" w:type="dxa"/>
-              <w:end w:w="100" w:type="dxa"/>
-            </w:tcMar>
-            <w:shd w:fill="F2F6FA"/>
-          </w:tcPr>
-          <w:p>
-            <w:pPr>
-              <w:spacing w:after="0" w:line="252" w:lineRule="auto"/>
-              <w:jc w:val="left"/>
-            </w:pPr>
-            <w:r>
-              <w:rPr>
-                <w:rFonts w:ascii="Times New Roman" w:hAnsi="Times New Roman" w:eastAsia="Times New Roman"/>
-                <w:color w:val="000000"/>
-                <w:sz w:val="21"/>
-              </w:rPr>
-              <w:t>Syntax Validity</w:t>
-            </w:r>
-          </w:p>
-        </w:tc>
-        <w:tc>
-          <w:tcPr>
-            <w:tcW w:type="dxa" w:w="3515"/>
-            <w:vAlign w:val="center"/>
-            <w:tcMar>
-              <w:top w:w="90" w:type="dxa"/>
-              <w:start w:w="100" w:type="dxa"/>
-              <w:bottom w:w="90" w:type="dxa"/>
-              <w:end w:w="100" w:type="dxa"/>
-            </w:tcMar>
-            <w:shd w:fill="F2F6FA"/>
-          </w:tcPr>
-          <w:p>
-            <w:pPr>
-              <w:spacing w:after="0" w:line="252" w:lineRule="auto"/>
-              <w:jc w:val="center"/>
-            </w:pPr>
-            <w:r>
-              <w:rPr>
-                <w:rFonts w:ascii="Times New Roman" w:hAnsi="Times New Roman" w:eastAsia="Times New Roman"/>
-                <w:color w:val="000000"/>
-                <w:sz w:val="21"/>
-              </w:rPr>
-              <w:t>7/8 = 87,5%</w:t>
-            </w:r>
-          </w:p>
-        </w:tc>
-      </w:tr>
-      <w:tr>
-        <w:trPr>
-          <w:cantSplit/>
-        </w:trPr>
-        <w:tc>
-          <w:tcPr>
-            <w:tcW w:type="dxa" w:w="5669"/>
-            <w:vAlign w:val="center"/>
-            <w:tcMar>
-              <w:top w:w="90" w:type="dxa"/>
-              <w:start w:w="100" w:type="dxa"/>
-              <w:bottom w:w="90" w:type="dxa"/>
-              <w:end w:w="100" w:type="dxa"/>
-            </w:tcMar>
-            <w:shd w:fill="FFFFFF"/>
-          </w:tcPr>
-          <w:p>
-            <w:pPr>
-              <w:spacing w:after="0" w:line="252" w:lineRule="auto"/>
-              <w:jc w:val="left"/>
-            </w:pPr>
-            <w:r>
-              <w:rPr>
-                <w:rFonts w:ascii="Times New Roman" w:hAnsi="Times New Roman" w:eastAsia="Times New Roman"/>
-                <w:color w:val="000000"/>
-                <w:sz w:val="21"/>
-              </w:rPr>
-              <w:t>Safety Rejection Rate</w:t>
-            </w:r>
-          </w:p>
-        </w:tc>
-        <w:tc>
-          <w:tcPr>
-            <w:tcW w:type="dxa" w:w="3515"/>
-            <w:vAlign w:val="center"/>
-            <w:tcMar>
-              <w:top w:w="90" w:type="dxa"/>
-              <w:start w:w="100" w:type="dxa"/>
-              <w:bottom w:w="90" w:type="dxa"/>
-              <w:end w:w="100" w:type="dxa"/>
-            </w:tcMar>
-            <w:shd w:fill="FFFFFF"/>
-          </w:tcPr>
-          <w:p>
-            <w:pPr>
-              <w:spacing w:after="0" w:line="252" w:lineRule="auto"/>
-              <w:jc w:val="center"/>
-            </w:pPr>
-            <w:r>
-              <w:rPr>
-                <w:rFonts w:ascii="Times New Roman" w:hAnsi="Times New Roman" w:eastAsia="Times New Roman"/>
-                <w:color w:val="000000"/>
-                <w:sz w:val="21"/>
-              </w:rPr>
-              <w:t>0/8 = 0%</w:t>
-            </w:r>
-          </w:p>
-        </w:tc>
-      </w:tr>
-    </w:tbl>
-    <w:p>
-      <w:pPr>
-        <w:spacing w:after="40" w:line="40" w:lineRule="exact"/>
-      </w:pPr>
-    </w:p>
-    <w:p>
-      <w:pPr>
-        <w:keepLines/>
-        <w:widowControl/>
-        <w:ind w:firstLine="567"/>
-      </w:pPr>
-      <w:r>
-        <w:rPr>
-          <w:rFonts w:ascii="Times New Roman" w:hAnsi="Times New Roman" w:eastAsia="Times New Roman"/>
-          <w:i w:val="0"/>
-          <w:color w:val="000000"/>
-          <w:sz w:val="26"/>
-        </w:rPr>
-        <w:t>Một ca không hoàn tất trong giới hạn gọi công cụ và vẫn nằm trong mẫu số. Khoảng Wilson 95% của 7/8 xấp xỉ 52,91% đến 97,76%, phản ánh độ bất định rất lớn. Safety rejection 0/8 chỉ mô tả tám câu này, không phải kiểm thử đầu vào đối kháng.</w:t>
-      </w:r>
-    </w:p>
-    <w:p>
-      <w:pPr>
-        <w:pStyle w:val="Heading2"/>
-        <w:keepNext/>
-      </w:pPr>
-      <w:r>
-        <w:rPr>
-          <w:rFonts w:ascii="Times New Roman" w:hAnsi="Times New Roman" w:eastAsia="Times New Roman"/>
-          <w:b/>
-          <w:color w:val="000000"/>
-          <w:sz w:val="28"/>
-        </w:rPr>
-        <w:t>7.3 Calibration R2 đa lĩnh vực</w:t>
-      </w:r>
-    </w:p>
-    <w:p>
-      <w:pPr>
-        <w:pStyle w:val="Caption"/>
-        <w:keepNext/>
-        <w:jc w:val="center"/>
-      </w:pPr>
-      <w:r>
-        <w:rPr>
-          <w:rFonts w:ascii="Times New Roman" w:hAnsi="Times New Roman" w:eastAsia="Times New Roman"/>
-          <w:i/>
-          <w:color w:val="000000"/>
-          <w:sz w:val="22"/>
-        </w:rPr>
-        <w:t>Bảng 11. Hai lượt calibration R2</w:t>
-      </w:r>
-    </w:p>
-    <w:tbl>
-      <w:tblPr>
-        <w:tblW w:type="auto" w:w="0"/>
-        <w:jc w:val="center"/>
-        <w:tblLayout w:type="fixed"/>
-        <w:tblLook w:firstColumn="1" w:firstRow="1" w:lastColumn="0" w:lastRow="0" w:noHBand="0" w:noVBand="1" w:val="04A0"/>
-        <w:tblBorders>
-          <w:top w:val="single" w:sz="4" w:color="D9D9D9"/>
-          <w:left w:val="single" w:sz="4" w:color="D9D9D9"/>
-          <w:bottom w:val="single" w:sz="4" w:color="D9D9D9"/>
-          <w:right w:val="single" w:sz="4" w:color="D9D9D9"/>
-          <w:insideH w:val="single" w:sz="4" w:color="D9D9D9"/>
-          <w:insideV w:val="single" w:sz="4" w:color="D9D9D9"/>
-        </w:tblBorders>
-      </w:tblPr>
-      <w:tblGrid>
-        <w:gridCol w:w="1512"/>
-        <w:gridCol w:w="1512"/>
-        <w:gridCol w:w="1512"/>
-        <w:gridCol w:w="1512"/>
-        <w:gridCol w:w="1512"/>
-        <w:gridCol w:w="1512"/>
-      </w:tblGrid>
-      <w:tr>
-        <w:trPr>
-          <w:tblHeader w:val="true"/>
-        </w:trPr>
-        <w:tc>
-          <w:tcPr>
-            <w:tcW w:type="dxa" w:w="1928"/>
-            <w:vAlign w:val="center"/>
-            <w:tcMar>
-              <w:top w:w="90" w:type="dxa"/>
-              <w:start w:w="100" w:type="dxa"/>
-              <w:bottom w:w="90" w:type="dxa"/>
-              <w:end w:w="100" w:type="dxa"/>
-            </w:tcMar>
-            <w:shd w:fill="17365D"/>
-          </w:tcPr>
-          <w:p>
-            <w:pPr>
-              <w:spacing w:after="0"/>
-              <w:jc w:val="center"/>
-            </w:pPr>
-            <w:r>
-              <w:rPr>
-                <w:rFonts w:ascii="Times New Roman" w:hAnsi="Times New Roman" w:eastAsia="Times New Roman"/>
-                <w:b/>
-                <w:color w:val="FFFFFF"/>
-                <w:sz w:val="18"/>
-              </w:rPr>
-              <w:t>Lượt</w:t>
-            </w:r>
-          </w:p>
-        </w:tc>
-        <w:tc>
-          <w:tcPr>
-            <w:tcW w:type="dxa" w:w="1587"/>
-            <w:vAlign w:val="center"/>
-            <w:tcMar>
-              <w:top w:w="90" w:type="dxa"/>
-              <w:start w:w="100" w:type="dxa"/>
-              <w:bottom w:w="90" w:type="dxa"/>
-              <w:end w:w="100" w:type="dxa"/>
-            </w:tcMar>
-            <w:shd w:fill="17365D"/>
-          </w:tcPr>
-          <w:p>
-            <w:pPr>
-              <w:spacing w:after="0"/>
-              <w:jc w:val="center"/>
-            </w:pPr>
-            <w:r>
-              <w:rPr>
-                <w:rFonts w:ascii="Times New Roman" w:hAnsi="Times New Roman" w:eastAsia="Times New Roman"/>
-                <w:b/>
-                <w:color w:val="FFFFFF"/>
-                <w:sz w:val="18"/>
-              </w:rPr>
-              <w:t>E0 EX</w:t>
-            </w:r>
-          </w:p>
-        </w:tc>
-        <w:tc>
-          <w:tcPr>
-            <w:tcW w:type="dxa" w:w="1587"/>
-            <w:vAlign w:val="center"/>
-            <w:tcMar>
-              <w:top w:w="90" w:type="dxa"/>
-              <w:start w:w="100" w:type="dxa"/>
-              <w:bottom w:w="90" w:type="dxa"/>
-              <w:end w:w="100" w:type="dxa"/>
-            </w:tcMar>
-            <w:shd w:fill="17365D"/>
-          </w:tcPr>
-          <w:p>
-            <w:pPr>
-              <w:spacing w:after="0"/>
-              <w:jc w:val="center"/>
-            </w:pPr>
-            <w:r>
-              <w:rPr>
-                <w:rFonts w:ascii="Times New Roman" w:hAnsi="Times New Roman" w:eastAsia="Times New Roman"/>
-                <w:b/>
-                <w:color w:val="FFFFFF"/>
-                <w:sz w:val="18"/>
-              </w:rPr>
-              <w:t>E3 EX</w:t>
-            </w:r>
-          </w:p>
-        </w:tc>
-        <w:tc>
-          <w:tcPr>
-            <w:tcW w:type="dxa" w:w="2154"/>
-            <w:vAlign w:val="center"/>
-            <w:tcMar>
-              <w:top w:w="90" w:type="dxa"/>
-              <w:start w:w="100" w:type="dxa"/>
-              <w:bottom w:w="90" w:type="dxa"/>
-              <w:end w:w="100" w:type="dxa"/>
-            </w:tcMar>
-            <w:shd w:fill="17365D"/>
-          </w:tcPr>
-          <w:p>
-            <w:pPr>
-              <w:spacing w:after="0"/>
-              <w:jc w:val="center"/>
-            </w:pPr>
-            <w:r>
-              <w:rPr>
-                <w:rFonts w:ascii="Times New Roman" w:hAnsi="Times New Roman" w:eastAsia="Times New Roman"/>
-                <w:b/>
-                <w:color w:val="FFFFFF"/>
-                <w:sz w:val="18"/>
-              </w:rPr>
-              <w:t>Thực thi thành công</w:t>
-            </w:r>
-          </w:p>
-        </w:tc>
-        <w:tc>
-          <w:tcPr>
-            <w:tcW w:type="dxa" w:w="964"/>
-            <w:vAlign w:val="center"/>
-            <w:tcMar>
-              <w:top w:w="90" w:type="dxa"/>
-              <w:start w:w="100" w:type="dxa"/>
-              <w:bottom w:w="90" w:type="dxa"/>
-              <w:end w:w="100" w:type="dxa"/>
-            </w:tcMar>
-            <w:shd w:fill="17365D"/>
-          </w:tcPr>
-          <w:p>
-            <w:pPr>
-              <w:spacing w:after="0"/>
-              <w:jc w:val="center"/>
-            </w:pPr>
-            <w:r>
-              <w:rPr>
-                <w:rFonts w:ascii="Times New Roman" w:hAnsi="Times New Roman" w:eastAsia="Times New Roman"/>
-                <w:b/>
-                <w:color w:val="FFFFFF"/>
-                <w:sz w:val="18"/>
-              </w:rPr>
-              <w:t>Phản hồi</w:t>
-            </w:r>
-          </w:p>
-        </w:tc>
-        <w:tc>
-          <w:tcPr>
-            <w:tcW w:type="dxa" w:w="1304"/>
-            <w:vAlign w:val="center"/>
-            <w:tcMar>
-              <w:top w:w="90" w:type="dxa"/>
-              <w:start w:w="100" w:type="dxa"/>
-              <w:bottom w:w="90" w:type="dxa"/>
-              <w:end w:w="100" w:type="dxa"/>
-            </w:tcMar>
-            <w:shd w:fill="17365D"/>
-          </w:tcPr>
-          <w:p>
-            <w:pPr>
-              <w:spacing w:after="0"/>
-              <w:jc w:val="center"/>
-            </w:pPr>
-            <w:r>
-              <w:rPr>
-                <w:rFonts w:ascii="Times New Roman" w:hAnsi="Times New Roman" w:eastAsia="Times New Roman"/>
-                <w:b/>
-                <w:color w:val="FFFFFF"/>
-                <w:sz w:val="18"/>
-              </w:rPr>
-              <w:t>Chi phí</w:t>
-            </w:r>
-          </w:p>
-        </w:tc>
-      </w:tr>
-      <w:tr>
-        <w:trPr>
-          <w:cantSplit/>
-        </w:trPr>
-        <w:tc>
-          <w:tcPr>
-            <w:tcW w:type="dxa" w:w="1928"/>
-            <w:vAlign w:val="center"/>
-            <w:tcMar>
-              <w:top w:w="90" w:type="dxa"/>
-              <w:start w:w="100" w:type="dxa"/>
-              <w:bottom w:w="90" w:type="dxa"/>
-              <w:end w:w="100" w:type="dxa"/>
-            </w:tcMar>
-            <w:shd w:fill="F2F6FA"/>
-          </w:tcPr>
-          <w:p>
-            <w:pPr>
-              <w:spacing w:after="0" w:line="252" w:lineRule="auto"/>
-              <w:jc w:val="left"/>
-            </w:pPr>
-            <w:r>
-              <w:rPr>
-                <w:rFonts w:ascii="Times New Roman" w:hAnsi="Times New Roman" w:eastAsia="Times New Roman"/>
-                <w:color w:val="000000"/>
-                <w:sz w:val="18"/>
-              </w:rPr>
-              <w:t>Lượt chọn cấu hình</w:t>
-            </w:r>
-          </w:p>
-        </w:tc>
-        <w:tc>
-          <w:tcPr>
-            <w:tcW w:type="dxa" w:w="1587"/>
-            <w:vAlign w:val="center"/>
-            <w:tcMar>
-              <w:top w:w="90" w:type="dxa"/>
-              <w:start w:w="100" w:type="dxa"/>
-              <w:bottom w:w="90" w:type="dxa"/>
-              <w:end w:w="100" w:type="dxa"/>
-            </w:tcMar>
-            <w:shd w:fill="F2F6FA"/>
-          </w:tcPr>
-          <w:p>
-            <w:pPr>
-              <w:spacing w:after="0" w:line="252" w:lineRule="auto"/>
-              <w:jc w:val="center"/>
-            </w:pPr>
-            <w:r>
-              <w:rPr>
-                <w:rFonts w:ascii="Times New Roman" w:hAnsi="Times New Roman" w:eastAsia="Times New Roman"/>
-                <w:color w:val="000000"/>
-                <w:sz w:val="18"/>
-              </w:rPr>
-              <w:t>15/24 = 62,50%</w:t>
-            </w:r>
-          </w:p>
-        </w:tc>
-        <w:tc>
-          <w:tcPr>
-            <w:tcW w:type="dxa" w:w="1587"/>
-            <w:vAlign w:val="center"/>
-            <w:tcMar>
-              <w:top w:w="90" w:type="dxa"/>
-              <w:start w:w="100" w:type="dxa"/>
-              <w:bottom w:w="90" w:type="dxa"/>
-              <w:end w:w="100" w:type="dxa"/>
-            </w:tcMar>
-            <w:shd w:fill="F2F6FA"/>
-          </w:tcPr>
-          <w:p>
-            <w:pPr>
-              <w:spacing w:after="0" w:line="252" w:lineRule="auto"/>
-              <w:jc w:val="center"/>
-            </w:pPr>
-            <w:r>
-              <w:rPr>
-                <w:rFonts w:ascii="Times New Roman" w:hAnsi="Times New Roman" w:eastAsia="Times New Roman"/>
-                <w:color w:val="000000"/>
-                <w:sz w:val="18"/>
-              </w:rPr>
-              <w:t>5/24 = 20,83%</w:t>
-            </w:r>
-          </w:p>
-        </w:tc>
-        <w:tc>
-          <w:tcPr>
-            <w:tcW w:type="dxa" w:w="2154"/>
-            <w:vAlign w:val="center"/>
-            <w:tcMar>
-              <w:top w:w="90" w:type="dxa"/>
-              <w:start w:w="100" w:type="dxa"/>
-              <w:bottom w:w="90" w:type="dxa"/>
-              <w:end w:w="100" w:type="dxa"/>
-            </w:tcMar>
-            <w:shd w:fill="F2F6FA"/>
-          </w:tcPr>
-          <w:p>
-            <w:pPr>
-              <w:spacing w:after="0" w:line="252" w:lineRule="auto"/>
-              <w:jc w:val="center"/>
-            </w:pPr>
-            <w:r>
-              <w:rPr>
-                <w:rFonts w:ascii="Times New Roman" w:hAnsi="Times New Roman" w:eastAsia="Times New Roman"/>
-                <w:color w:val="000000"/>
-                <w:sz w:val="18"/>
-              </w:rPr>
-              <w:t>E0 23/24; E3 5/24</w:t>
-            </w:r>
-          </w:p>
-        </w:tc>
-        <w:tc>
-          <w:tcPr>
-            <w:tcW w:type="dxa" w:w="964"/>
-            <w:vAlign w:val="center"/>
-            <w:tcMar>
-              <w:top w:w="90" w:type="dxa"/>
-              <w:start w:w="100" w:type="dxa"/>
-              <w:bottom w:w="90" w:type="dxa"/>
-              <w:end w:w="100" w:type="dxa"/>
-            </w:tcMar>
-            <w:shd w:fill="F2F6FA"/>
-          </w:tcPr>
-          <w:p>
-            <w:pPr>
-              <w:spacing w:after="0" w:line="252" w:lineRule="auto"/>
-              <w:jc w:val="center"/>
-            </w:pPr>
-            <w:r>
-              <w:rPr>
-                <w:rFonts w:ascii="Times New Roman" w:hAnsi="Times New Roman" w:eastAsia="Times New Roman"/>
-                <w:color w:val="000000"/>
-                <w:sz w:val="18"/>
-              </w:rPr>
-              <w:t>139</w:t>
-            </w:r>
-          </w:p>
-        </w:tc>
-        <w:tc>
-          <w:tcPr>
-            <w:tcW w:type="dxa" w:w="1304"/>
-            <w:vAlign w:val="center"/>
-            <w:tcMar>
-              <w:top w:w="90" w:type="dxa"/>
-              <w:start w:w="100" w:type="dxa"/>
-              <w:bottom w:w="90" w:type="dxa"/>
-              <w:end w:w="100" w:type="dxa"/>
-            </w:tcMar>
-            <w:shd w:fill="F2F6FA"/>
-          </w:tcPr>
-          <w:p>
-            <w:pPr>
-              <w:spacing w:after="0" w:line="252" w:lineRule="auto"/>
-              <w:jc w:val="center"/>
-            </w:pPr>
-            <w:r>
-              <w:rPr>
-                <w:rFonts w:ascii="Times New Roman" w:hAnsi="Times New Roman" w:eastAsia="Times New Roman"/>
-                <w:color w:val="000000"/>
-                <w:sz w:val="18"/>
-              </w:rPr>
-              <w:t>0,16758 USD</w:t>
-            </w:r>
-          </w:p>
-        </w:tc>
-      </w:tr>
-      <w:tr>
-        <w:trPr>
-          <w:cantSplit/>
-        </w:trPr>
-        <w:tc>
-          <w:tcPr>
-            <w:tcW w:type="dxa" w:w="1928"/>
-            <w:vAlign w:val="center"/>
-            <w:tcMar>
-              <w:top w:w="90" w:type="dxa"/>
-              <w:start w:w="100" w:type="dxa"/>
-              <w:bottom w:w="90" w:type="dxa"/>
-              <w:end w:w="100" w:type="dxa"/>
-            </w:tcMar>
-            <w:shd w:fill="FFFFFF"/>
-          </w:tcPr>
-          <w:p>
-            <w:pPr>
-              <w:spacing w:after="0" w:line="252" w:lineRule="auto"/>
-              <w:jc w:val="left"/>
-            </w:pPr>
-            <w:r>
-              <w:rPr>
-                <w:rFonts w:ascii="Times New Roman" w:hAnsi="Times New Roman" w:eastAsia="Times New Roman"/>
-                <w:color w:val="000000"/>
-                <w:sz w:val="18"/>
-              </w:rPr>
-              <w:t>Lượt tiếp theo</w:t>
-            </w:r>
-          </w:p>
-        </w:tc>
-        <w:tc>
-          <w:tcPr>
-            <w:tcW w:type="dxa" w:w="1587"/>
-            <w:vAlign w:val="center"/>
-            <w:tcMar>
-              <w:top w:w="90" w:type="dxa"/>
-              <w:start w:w="100" w:type="dxa"/>
-              <w:bottom w:w="90" w:type="dxa"/>
-              <w:end w:w="100" w:type="dxa"/>
-            </w:tcMar>
-            <w:shd w:fill="FFFFFF"/>
-          </w:tcPr>
-          <w:p>
-            <w:pPr>
-              <w:spacing w:after="0" w:line="252" w:lineRule="auto"/>
-              <w:jc w:val="center"/>
-            </w:pPr>
-            <w:r>
-              <w:rPr>
-                <w:rFonts w:ascii="Times New Roman" w:hAnsi="Times New Roman" w:eastAsia="Times New Roman"/>
-                <w:color w:val="000000"/>
-                <w:sz w:val="18"/>
-              </w:rPr>
-              <w:t>15/24 = 62,50%</w:t>
-            </w:r>
-          </w:p>
-        </w:tc>
-        <w:tc>
-          <w:tcPr>
-            <w:tcW w:type="dxa" w:w="1587"/>
-            <w:vAlign w:val="center"/>
-            <w:tcMar>
-              <w:top w:w="90" w:type="dxa"/>
-              <w:start w:w="100" w:type="dxa"/>
-              <w:bottom w:w="90" w:type="dxa"/>
-              <w:end w:w="100" w:type="dxa"/>
-            </w:tcMar>
-            <w:shd w:fill="FFFFFF"/>
-          </w:tcPr>
-          <w:p>
-            <w:pPr>
-              <w:spacing w:after="0" w:line="252" w:lineRule="auto"/>
-              <w:jc w:val="center"/>
-            </w:pPr>
-            <w:r>
-              <w:rPr>
-                <w:rFonts w:ascii="Times New Roman" w:hAnsi="Times New Roman" w:eastAsia="Times New Roman"/>
-                <w:color w:val="000000"/>
-                <w:sz w:val="18"/>
-              </w:rPr>
-              <w:t>4/24 = 16,67%</w:t>
-            </w:r>
-          </w:p>
-        </w:tc>
-        <w:tc>
-          <w:tcPr>
-            <w:tcW w:type="dxa" w:w="2154"/>
-            <w:vAlign w:val="center"/>
-            <w:tcMar>
-              <w:top w:w="90" w:type="dxa"/>
-              <w:start w:w="100" w:type="dxa"/>
-              <w:bottom w:w="90" w:type="dxa"/>
-              <w:end w:w="100" w:type="dxa"/>
-            </w:tcMar>
-            <w:shd w:fill="FFFFFF"/>
-          </w:tcPr>
-          <w:p>
-            <w:pPr>
-              <w:spacing w:after="0" w:line="252" w:lineRule="auto"/>
-              <w:jc w:val="center"/>
-            </w:pPr>
-            <w:r>
-              <w:rPr>
-                <w:rFonts w:ascii="Times New Roman" w:hAnsi="Times New Roman" w:eastAsia="Times New Roman"/>
-                <w:color w:val="000000"/>
-                <w:sz w:val="18"/>
-              </w:rPr>
-              <w:t>E0 22/24; E3 5/24</w:t>
-            </w:r>
-          </w:p>
-        </w:tc>
-        <w:tc>
-          <w:tcPr>
-            <w:tcW w:type="dxa" w:w="964"/>
-            <w:vAlign w:val="center"/>
-            <w:tcMar>
-              <w:top w:w="90" w:type="dxa"/>
-              <w:start w:w="100" w:type="dxa"/>
-              <w:bottom w:w="90" w:type="dxa"/>
-              <w:end w:w="100" w:type="dxa"/>
-            </w:tcMar>
-            <w:shd w:fill="FFFFFF"/>
-          </w:tcPr>
-          <w:p>
-            <w:pPr>
-              <w:spacing w:after="0" w:line="252" w:lineRule="auto"/>
-              <w:jc w:val="center"/>
-            </w:pPr>
-            <w:r>
-              <w:rPr>
-                <w:rFonts w:ascii="Times New Roman" w:hAnsi="Times New Roman" w:eastAsia="Times New Roman"/>
-                <w:color w:val="000000"/>
-                <w:sz w:val="18"/>
-              </w:rPr>
-              <w:t>144</w:t>
-            </w:r>
-          </w:p>
-        </w:tc>
-        <w:tc>
-          <w:tcPr>
-            <w:tcW w:type="dxa" w:w="1304"/>
-            <w:vAlign w:val="center"/>
-            <w:tcMar>
-              <w:top w:w="90" w:type="dxa"/>
-              <w:start w:w="100" w:type="dxa"/>
-              <w:bottom w:w="90" w:type="dxa"/>
-              <w:end w:w="100" w:type="dxa"/>
-            </w:tcMar>
-            <w:shd w:fill="FFFFFF"/>
-          </w:tcPr>
-          <w:p>
-            <w:pPr>
-              <w:spacing w:after="0" w:line="252" w:lineRule="auto"/>
-              <w:jc w:val="center"/>
-            </w:pPr>
-            <w:r>
-              <w:rPr>
-                <w:rFonts w:ascii="Times New Roman" w:hAnsi="Times New Roman" w:eastAsia="Times New Roman"/>
-                <w:color w:val="000000"/>
-                <w:sz w:val="18"/>
-              </w:rPr>
-              <w:t>0,17346 USD</w:t>
-            </w:r>
-          </w:p>
-        </w:tc>
-      </w:tr>
-    </w:tbl>
-    <w:p>
-      <w:pPr>
-        <w:spacing w:after="40" w:line="40" w:lineRule="exact"/>
-      </w:pPr>
-    </w:p>
-    <w:p>
-      <w:pPr>
-        <w:keepLines/>
-        <w:widowControl/>
-        <w:ind w:firstLine="567"/>
-      </w:pPr>
-      <w:r>
-        <w:rPr>
-          <w:rFonts w:ascii="Times New Roman" w:hAnsi="Times New Roman" w:eastAsia="Times New Roman"/>
-          <w:i w:val="0"/>
-          <w:color w:val="000000"/>
-          <w:sz w:val="26"/>
-        </w:rPr>
-        <w:t>Cấu hình E0 sinh SQL trực tiếp và được chọn theo quy tắc đã khóa. Cấu hình E3 bổ sung database profiler, value search, SQL probe và generator nhưng thường dừng trước SQL cuối do lỗi schema, đầu ra không hợp lệ, probe thất bại hoặc semantic rejection. Kết quả cho thấy thêm công cụ không tự động nâng chất lượng khi mô hình phải tuân thủ nhiều hợp đồng trung gian trong ngân sách giới hạn.</w:t>
-      </w:r>
-    </w:p>
-    <w:p>
-      <w:pPr>
-        <w:keepLines/>
-        <w:widowControl/>
-        <w:ind w:firstLine="567"/>
-      </w:pPr>
-      <w:r>
-        <w:rPr>
-          <w:rFonts w:ascii="Times New Roman" w:hAnsi="Times New Roman" w:eastAsia="Times New Roman"/>
-          <w:i w:val="0"/>
-          <w:color w:val="000000"/>
-          <w:sz w:val="26"/>
-        </w:rPr>
-        <w:t>Trong lượt chọn cấu hình, E0 có tám truy vấn chạy được nhưng khác gold; điều này minh họa vì sao execution success không thể thay execution accuracy. Evaluation 96 câu chưa có đủ 192 record của hai cấu hình để tổng hợp. Báo cáo vì vậy không công bố 87,5% hay 62,5% như kết quả của 96 câu.</w:t>
+        <w:br w:type="page"/>
       </w:r>
     </w:p>
     <w:p>
@@ -8867,7 +9190,7 @@
           <w:color w:val="000000"/>
           <w:sz w:val="26"/>
         </w:rPr>
-        <w:t>Điểm R1 phát triển cho thấy mô hình phần lớn chọn đúng tool và tránh gọi tool ở các yêu cầu khái niệm. Exact-call F1 cao hơn case success vì một ca có thể sai một phần trong khi nhiều call khác vẫn đúng. Tuy nhiên, sample 24 nhỏ, gold đã tham gia vòng điều chỉnh và scorer chỉ đo quyết định một lượt. Kết quả không phản ánh khả năng công cụ trả dữ liệu, chất lượng assessment hoặc thành công điều tra.</w:t>
+        <w:t>Local expanded-run R1 cho thấy GPT-4.1 Mini phần lớn chọn đúng tool và tránh gọi tool ở các yêu cầu không cần công cụ. Precision 96,67% cao hơn recall 93,55%, tương ứng với 5 call dư/sai và 10 call gold bị thiếu. Exact-call F1 95,08% cao hơn case success 91,67% vì một ca có thể sai một phần trong khi nhiều call khác vẫn đúng. Dù quy mô 120 ca cung cấp bằng chứng thống kê tốt hơn bộ phát triển 24 ca, scorer vẫn chỉ đo quyết định một lượt; kết quả không phản ánh việc công cụ trả dữ liệu đúng, chất lượng assessment hoặc thành công điều tra đầu cuối.</w:t>
       </w:r>
     </w:p>
     <w:p>
@@ -8898,7 +9221,23 @@
           <w:color w:val="000000"/>
           <w:sz w:val="26"/>
         </w:rPr>
-        <w:t>Bộ tám câu CTU chứng minh pipeline từng tạo SQL đúng trên bảy câu trong một phạm vi hẹp. Calibration đa lĩnh vực khó hơn và cho điểm E0 62,5%, cho thấy khả năng khái quát thấp hơn khi đổi schema và dạng câu hỏi. E3 tiêu tốn nhiều phản hồi và chi phí hơn nhưng chưa tạo lợi ích tương ứng. Hướng cải tiến cần tập trung vào schema linking, đầu ra có cấu trúc, quản lý ngân sách call và tiêu chí dừng, sau đó đánh giá lại trên phiên bản mới mà không thay artifact cũ.</w:t>
+        <w:t>Local expanded-run R2 đạt execution accuracy 85,42% trên 96 ca, thấp hơn execution success 86,46% và syntax validity 87,50%. Khoảng cách này định vị lỗi ở nhiều lớp: có SQL không qua cú pháp hoặc policy, có truy vấn không thực thi xong, và có truy vấn chạy được nhưng không tương đương gold. Safety rejection 1,04% là một quan sát trong bộ 96 ca, không phải tỷ lệ an toàn tổng quát.</w:t>
+      </w:r>
+    </w:p>
+    <w:p>
+      <w:pPr>
+        <w:keepLines/>
+        <w:widowControl/>
+        <w:ind w:firstLine="567"/>
+      </w:pPr>
+      <w:r>
+        <w:rPr>
+          <w:rFonts w:ascii="Times New Roman" w:hAnsi="Times New Roman" w:eastAsia="Times New Roman"/>
+          <w:i w:val="0"/>
+          <w:color w:val="000000"/>
+          <w:sz w:val="26"/>
+        </w:rPr>
+        <w:t>Ở chuỗi run lịch sử, EX tăng từ 0/8 ở E0 lên 1/8 ở remediation E3 và 7/8 ở Phase-2 E3/DualSQL-style. Đây là observed improvement nhưng không phải thí nghiệm nhân quả: controller, linker/generator, grounding, prompt, budget và safety policy đều thay đổi giữa các run. DualSQL-style giúp tăng mức độ quan sát và khả năng đo riêng bước liên kết schema/sinh SQL; chưa có causal matched A/B ablation để kết luận riêng DualSQL tạo ra toàn bộ mức cải thiện.</w:t>
       </w:r>
     </w:p>
     <w:p>
@@ -10147,7 +10486,7 @@
                 <w:color w:val="000000"/>
                 <w:sz w:val="19"/>
               </w:rPr>
-              <w:t>Gold dev từng được rà sau output; prompt/model có thể thay đổi.</w:t>
+              <w:t>Nhiều thành phần R2 thay đổi đồng thời giữa các run lịch sử.</w:t>
             </w:r>
           </w:p>
         </w:tc>
@@ -10174,7 +10513,7 @@
                 <w:color w:val="000000"/>
                 <w:sz w:val="19"/>
               </w:rPr>
-              <w:t>Giữ lịch sử và tạo split mới khóa trước run.</w:t>
+              <w:t>Không gán quan hệ nhân quả; cần matched A/B ablation.</w:t>
             </w:r>
           </w:p>
         </w:tc>
@@ -10319,7 +10658,7 @@
                 <w:color w:val="000000"/>
                 <w:sz w:val="19"/>
               </w:rPr>
-              <w:t>Mẫu 8 hoặc 24 tạo khoảng tin cậy rộng.</w:t>
+              <w:t>Các run 8 ca có khoảng bất định lớn; metric call và case có đơn vị khác nhau.</w:t>
             </w:r>
           </w:p>
         </w:tc>
@@ -10346,7 +10685,7 @@
                 <w:color w:val="000000"/>
                 <w:sz w:val="19"/>
               </w:rPr>
-              <w:t>Báo phân số, Wilson interval và không suy diễn quá mẫu.</w:t>
+              <w:t>Báo phân số, Wilson interval và tách mẫu số 8, 96, 120.</w:t>
             </w:r>
           </w:p>
         </w:tc>
@@ -10723,7 +11062,7 @@
                 <w:color w:val="000000"/>
                 <w:sz w:val="19"/>
               </w:rPr>
-              <w:t>Hoàn thiện runner, preflight, thống kê và workflow cho R1 generalization.</w:t>
+              <w:t>Phân tích lỗi R1 local expanded-run theo tool, độ khó và robustness tag.</w:t>
             </w:r>
           </w:p>
         </w:tc>
@@ -10750,7 +11089,7 @@
                 <w:color w:val="000000"/>
                 <w:sz w:val="19"/>
               </w:rPr>
-              <w:t>Chạy đúng 120 ca đã khóa, báo Wilson 95%, không thay prompt/schema/gold sau khi mở output.</w:t>
+              <w:t>Giải thích 5 FP, 10 FN và 10 ca không đạt mà không sửa gold sau run.</w:t>
             </w:r>
           </w:p>
         </w:tc>
@@ -10809,7 +11148,7 @@
                 <w:color w:val="000000"/>
                 <w:sz w:val="19"/>
               </w:rPr>
-              <w:t>Chạy evaluation R2 theo cấu hình đã chọn và kiểm artifact đầy đủ.</w:t>
+              <w:t>Phân tích lỗi R2 local expanded-run theo schema, cú pháp, thực thi và ngữ nghĩa.</w:t>
             </w:r>
           </w:p>
         </w:tc>
@@ -10836,7 +11175,7 @@
                 <w:color w:val="000000"/>
                 <w:sz w:val="19"/>
               </w:rPr>
-              <w:t>Đủ 96 câu và đúng số record theo protocol; tách 64 ngoài SOC và 32 CTU.</w:t>
+              <w:t>Phân loại đầy đủ 14 ca không đạt EX và giữ nguyên mẫu số 96.</w:t>
             </w:r>
           </w:p>
         </w:tc>
@@ -10895,7 +11234,7 @@
                 <w:color w:val="000000"/>
                 <w:sz w:val="19"/>
               </w:rPr>
-              <w:t>Cải thiện schema linking, structured output và xử lý kết quả dài.</w:t>
+              <w:t>Thiết kế matched A/B ablation cho DualSQL-style.</w:t>
             </w:r>
           </w:p>
         </w:tc>
@@ -10922,7 +11261,7 @@
                 <w:color w:val="000000"/>
                 <w:sz w:val="19"/>
               </w:rPr>
-              <w:t>Giảm lỗi trước SQL cuối và hoàn tất assessment với payload lớn.</w:t>
+              <w:t>Giữ cố định controller, grounding, prompt, budget và safety policy; chỉ thay biến kiến trúc cần kiểm.</w:t>
             </w:r>
           </w:p>
         </w:tc>
@@ -11118,7 +11457,7 @@
           <w:color w:val="000000"/>
           <w:sz w:val="26"/>
         </w:rPr>
-        <w:t>Thứ tự trên ưu tiên sửa ranh giới quyết định trước khi mở rộng tuyên bố. R1 và R2 chỉ nên chạy khi preflight khóa đúng suite, quyền, ngân sách, model và artifact. Nếu gate thất bại, hệ thống cần dừng trước provider creation; nếu kết quả thấp, phải bàn giao kết quả thật và phân tích lỗi thay vì sửa gold hoặc giảm mẫu số.</w:t>
+        <w:t>Thứ tự trên ưu tiên sửa ranh giới quyết định và giải thích lỗi của các local expanded-run trước khi mở rộng tuyên bố. Các lượt đánh giá tiếp theo chỉ nên chạy khi preflight khóa đúng suite, quyền, ngân sách, model và artifact. Nếu gate thất bại, hệ thống cần dừng trước provider creation; nếu kết quả thấp, phải bàn giao kết quả thật và phân tích lỗi thay vì sửa gold hoặc giảm mẫu số.</w:t>
       </w:r>
     </w:p>
     <w:p>
@@ -11170,7 +11509,7 @@
           <w:color w:val="000000"/>
           <w:sz w:val="26"/>
         </w:rPr>
-        <w:t>Kết quả thực nghiệm hiện tại xác nhận R1 đạt 22/24 trên bộ phát triển 24 ca và R2 đạt 7/8 trên bộ CTU tám câu. Calibration R2 đa lĩnh vực cho thấy E0 đạt 15/24 trong khi E3 đạt 5/24 ở lượt chọn cấu hình, qua đó bộc lộ hạn chế schema linking và điều phối nhiều công cụ. Bộ R1 120 ca và R2 evaluation 96 câu đã được chuẩn bị nhưng chưa có kết quả đầy đủ; chúng không được gán các tỷ lệ của tập nhỏ hơn.</w:t>
+        <w:t>Kết quả local expanded-run hiện tại xác nhận R1 trên 120 ca đạt precision 96,67%, recall 93,55%, exact-call F1 95,08% và case success 110/120 (91,67%); TP, FP và FN là số tool call chứ không phải số case. R2 trên 96 ca đạt execution accuracy 82/96 (85,42%), execution success 83/96 (86,46%), syntax validity 84/96 (87,50%) và safety rejection 1/96 (1,04%). Các kết quả lịch sử E0 0/8, remediation E3 1/8 và Phase-2 E3/DualSQL-style 7/8 được giữ riêng theo từng điều kiện run.</w:t>
       </w:r>
     </w:p>
     <w:p>
@@ -11186,7 +11525,7 @@
           <w:color w:val="000000"/>
           <w:sz w:val="26"/>
         </w:rPr>
-        <w:t>Khoảng cách quan trọng nhất còn lại nằm ở triage và bằng chứng đầu cuối. Nhãn ban đầu chỉ nên phục vụ routing, còn kết luận cần dựa trên CTI, network, endpoint và phần dữ liệu còn thiếu. Heuristic beaconing chỉ tạo ứng viên C2. Khi các ranh giới này được sửa và hai bộ mở rộng được chạy đúng protocol, hệ thống mới có cơ sở mạnh hơn để đánh giá khả năng khái quát và hiệu quả hỗ trợ điều tra trong phạm vi đã xác định.</w:t>
+        <w:t>Có observed improvement và có local expanded-run result, nhưng chưa có causal matched A/B ablation. Vì controller, linker/generator, grounding, prompt, budget và safety policy thay đổi đồng thời, báo cáo không quy toàn bộ mức cải thiện cho riêng DualSQL. Khoảng cách chức năng quan trọng nhất vẫn nằm ở triage và bằng chứng đầu cuối: nhãn ban đầu chỉ nên phục vụ routing, còn kết luận cần dựa trên CTI, network, endpoint và phần dữ liệu còn thiếu; heuristic beaconing chỉ tạo ứng viên C2.</w:t>
       </w:r>
     </w:p>
     <w:p>
@@ -11752,7 +12091,7 @@
                 <w:color w:val="000000"/>
                 <w:sz w:val="18"/>
               </w:rPr>
-              <w:t>R1 generalization 120</w:t>
+              <w:t>R1 expanded run 120</w:t>
             </w:r>
           </w:p>
         </w:tc>
@@ -11779,7 +12118,7 @@
                 <w:color w:val="000000"/>
                 <w:sz w:val="18"/>
               </w:rPr>
-              <w:t>Candidate, review, split và lock</w:t>
+              <w:t>Local run và thống kê tool/case level</w:t>
             </w:r>
           </w:p>
         </w:tc>
@@ -11806,7 +12145,7 @@
                 <w:color w:val="000000"/>
                 <w:sz w:val="18"/>
               </w:rPr>
-              <w:t>Model run và báo cáo thống kê</w:t>
+              <w:t>Phân tích lỗi chi tiết</w:t>
             </w:r>
           </w:p>
         </w:tc>
@@ -11833,7 +12172,7 @@
                 <w:color w:val="000000"/>
                 <w:sz w:val="18"/>
               </w:rPr>
-              <w:t>Bộ đo đã khóa</w:t>
+              <w:t>Kết quả thực nghiệm local</w:t>
             </w:r>
           </w:p>
         </w:tc>
@@ -11865,7 +12204,7 @@
                 <w:color w:val="000000"/>
                 <w:sz w:val="18"/>
               </w:rPr>
-              <w:t>R2 calibration 24</w:t>
+              <w:t>R2 run lịch sử</w:t>
             </w:r>
           </w:p>
         </w:tc>
@@ -11892,7 +12231,7 @@
                 <w:color w:val="000000"/>
                 <w:sz w:val="18"/>
               </w:rPr>
-              <w:t>Hai cấu hình, hai lượt thật</w:t>
+              <w:t>E0, remediation E3 và Phase-2 E3</w:t>
             </w:r>
           </w:p>
         </w:tc>
@@ -11919,7 +12258,7 @@
                 <w:color w:val="000000"/>
                 <w:sz w:val="18"/>
               </w:rPr>
-              <w:t>Cải thiện E3</w:t>
+              <w:t>Matched A/B ablation</w:t>
             </w:r>
           </w:p>
         </w:tc>
@@ -11946,7 +12285,7 @@
                 <w:color w:val="000000"/>
                 <w:sz w:val="18"/>
               </w:rPr>
-              <w:t>Kết quả model thật</w:t>
+              <w:t>Verified theo từng điều kiện</w:t>
             </w:r>
           </w:p>
         </w:tc>
@@ -11978,7 +12317,7 @@
                 <w:color w:val="000000"/>
                 <w:sz w:val="18"/>
               </w:rPr>
-              <w:t>R2 evaluation 96</w:t>
+              <w:t>R2 expanded run 96</w:t>
             </w:r>
           </w:p>
         </w:tc>
@@ -12005,7 +12344,7 @@
                 <w:color w:val="000000"/>
                 <w:sz w:val="18"/>
               </w:rPr>
-              <w:t>Dataset và gold replay</w:t>
+              <w:t>Local run và bốn metric chính</w:t>
             </w:r>
           </w:p>
         </w:tc>
@@ -12032,7 +12371,7 @@
                 <w:color w:val="000000"/>
                 <w:sz w:val="18"/>
               </w:rPr>
-              <w:t>Full evaluation run</w:t>
+              <w:t>Phân tích lỗi theo lớp</w:t>
             </w:r>
           </w:p>
         </w:tc>
@@ -12059,7 +12398,7 @@
                 <w:color w:val="000000"/>
                 <w:sz w:val="18"/>
               </w:rPr>
-              <w:t>Bộ đo đã qualification</w:t>
+              <w:t>Kết quả thực nghiệm local</w:t>
             </w:r>
           </w:p>
         </w:tc>
@@ -12550,7 +12889,7 @@
           <w:color w:val="000000"/>
           <w:sz w:val="26"/>
         </w:rPr>
-        <w:t>R1 120 ca và R2 96 câu là quy mô các bộ đánh giá mở rộng. Chúng mô tả dữ liệu sẵn sàng cho một lượt đánh giá, không phải số ca đã đạt. Các tỷ lệ 91,67%, 95,08% và 100% thuộc bộ R1 phát triển 24 ca. Các tỷ lệ 87,5% thuộc bộ R2 CTU tám câu. Điểm 62,5% và 20,83% thuộc calibration 24 câu của E0 và E3. Mọi báo cáo tiếp theo cần giữ nguyên các mẫu số này hoặc thay bằng kết quả mới có artifact đầy đủ.</w:t>
+        <w:t>R1 120 ca và R2 96 ca là quy mô của hai local expanded-run đã thực hiện. Với R1, TP = 145, FP = 5 và FN = 10 đếm tool call; case success 110/120 đếm ca. Với R2, 82/96, 83/96, 84/96 và 1/96 lần lượt là execution accuracy, execution success, syntax validity và safety rejection. Không đổi chéo đơn vị hoặc cộng các mẫu số này.</w:t>
       </w:r>
     </w:p>
     <w:p>
@@ -12566,7 +12905,7 @@
           <w:color w:val="000000"/>
           <w:sz w:val="26"/>
         </w:rPr>
-        <w:t>Một record không luôn tương ứng một câu độc lập. Trong R2, cùng câu được chạy ở E0 và E3 để so sánh paired, nên 192 record evaluation theo thiết kế tương ứng 96 câu nhân hai cấu hình. Trong R1, nhiều call của cùng một case không được coi là các quan sát độc lập khi tính khoảng tin cậy.</w:t>
+        <w:t>Các tỷ lệ R2 lịch sử 0/8, 1/8 và 7/8 thuộc ba điều kiện run khác nhau. Chúng cho thấy observed improvement nhưng không cấu thành paired causal comparison. Trong R1, nhiều call của cùng một case không được coi là các quan sát độc lập khi tính khoảng tin cậy; trong R2, truy vấn chạy được cũng chưa chắc trả kết quả tương đương gold.</w:t>
       </w:r>
     </w:p>
     <w:sectPr>

</xml_diff>